<commit_message>
Amplía nota IMOAM a dos páginas con formato visual ENOE y datos metodológicos trazados
</commit_message>
<xml_diff>
--- a/docs/examples/notas/IMOAM_nota_piloto.docx
+++ b/docs/examples/notas/IMOAM_nota_piloto.docx
@@ -1,9 +1,233 @@
 
 <file path=word/document.xml><?xml version="1.0" encoding="utf-8"?>
-<w:document xmlns:wpc="http://schemas.microsoft.com/office/word/2010/wordprocessingCanvas" xmlns:cx="http://schemas.microsoft.com/office/drawing/2014/chartex" xmlns:cx1="http://schemas.microsoft.com/office/drawing/2015/9/8/chartex" xmlns:cx2="http://schemas.microsoft.com/office/drawing/2015/10/21/chartex" xmlns:cx3="http://schemas.microsoft.com/office/drawing/2016/5/9/chartex" xmlns:cx4="http://schemas.microsoft.com/office/drawing/2016/5/10/chartex" xmlns:cx5="http://schemas.microsoft.com/office/drawing/2016/5/11/chartex" xmlns:cx6="http://schemas.microsoft.com/office/drawing/2016/5/12/chartex" xmlns:cx7="http://schemas.microsoft.com/office/drawing/2016/5/13/chartex" xmlns:cx8="http://schemas.microsoft.com/office/drawing/2016/5/14/chartex" xmlns:mc="http://schemas.openxmlformats.org/markup-compatibility/2006" xmlns:aink="http://schemas.microsoft.com/office/drawing/2016/ink" xmlns:am3d="http://schemas.microsoft.com/office/drawing/2017/model3d" xmlns:o="urn:schemas-microsoft-com:office:office" xmlns:oel="http://schemas.microsoft.com/office/2019/extlst" xmlns:r="http://schemas.openxmlformats.org/officeDocument/2006/relationships" xmlns:m="http://schemas.openxmlformats.org/officeDocument/2006/math" xmlns:v="urn:schemas-microsoft-com:vml" xmlns:wp14="http://schemas.microsoft.com/office/word/2010/wordprocessingDrawing" xmlns:wp="http://schemas.openxmlformats.org/drawingml/2006/wordprocessingDrawing" xmlns:w10="urn:schemas-microsoft-com:office:word" xmlns:w="http://schemas.openxmlformats.org/wordprocessingml/2006/main" xmlns:w14="http://schemas.microsoft.com/office/word/2010/wordml" xmlns:w15="http://schemas.microsoft.com/office/word/2012/wordml" xmlns:w16cex="http://schemas.microsoft.com/office/word/2018/wordml/cex" xmlns:w16cid="http://schemas.microsoft.com/office/word/2016/wordml/cid" xmlns:w16="http://schemas.microsoft.com/office/word/2018/wordml" xmlns:w16du="http://schemas.microsoft.com/office/word/2023/wordml/word16du" xmlns:w16sdtdh="http://schemas.microsoft.com/office/word/2020/wordml/sdtdatahash" xmlns:w16se="http://schemas.microsoft.com/office/word/2015/wordml/symex" xmlns:wpg="http://schemas.microsoft.com/office/word/2010/wordprocessingGroup" xmlns:wpi="http://schemas.microsoft.com/office/word/2010/wordprocessingInk" xmlns:wne="http://schemas.microsoft.com/office/word/2006/wordml" xmlns:wps="http://schemas.microsoft.com/office/word/2010/wordprocessingShape" mc:Ignorable="w14 w15 w16se w16cid w16 w16cex w16sdtdh w16du wp14">
+<w:document xmlns:wpc="http://schemas.microsoft.com/office/word/2010/wordprocessingCanvas" xmlns:cx="http://schemas.microsoft.com/office/drawing/2014/chartex" xmlns:cx1="http://schemas.microsoft.com/office/drawing/2015/9/8/chartex" xmlns:cx2="http://schemas.microsoft.com/office/drawing/2015/10/21/chartex" xmlns:cx3="http://schemas.microsoft.com/office/drawing/2016/5/9/chartex" xmlns:cx4="http://schemas.microsoft.com/office/drawing/2016/5/10/chartex" xmlns:cx5="http://schemas.microsoft.com/office/drawing/2016/5/11/chartex" xmlns:cx6="http://schemas.microsoft.com/office/drawing/2016/5/12/chartex" xmlns:cx7="http://schemas.microsoft.com/office/drawing/2016/5/13/chartex" xmlns:cx8="http://schemas.microsoft.com/office/drawing/2016/5/14/chartex" xmlns:mc="http://schemas.openxmlformats.org/markup-compatibility/2006" xmlns:aink="http://schemas.microsoft.com/office/drawing/2016/ink" xmlns:am3d="http://schemas.microsoft.com/office/drawing/2017/model3d" xmlns:o="urn:schemas-microsoft-com:office:office" xmlns:r="http://schemas.openxmlformats.org/officeDocument/2006/relationships" xmlns:m="http://schemas.openxmlformats.org/officeDocument/2006/math" xmlns:v="urn:schemas-microsoft-com:vml" xmlns:wp14="http://schemas.microsoft.com/office/word/2010/wordprocessingDrawing" xmlns:wp="http://schemas.openxmlformats.org/drawingml/2006/wordprocessingDrawing" xmlns:w10="urn:schemas-microsoft-com:office:word" xmlns:w="http://schemas.openxmlformats.org/wordprocessingml/2006/main" xmlns:w14="http://schemas.microsoft.com/office/word/2010/wordml" xmlns:w15="http://schemas.microsoft.com/office/word/2012/wordml" xmlns:w16cid="http://schemas.microsoft.com/office/word/2016/wordml/cid" xmlns:w16se="http://schemas.microsoft.com/office/word/2015/wordml/symex" xmlns:wpg="http://schemas.microsoft.com/office/word/2010/wordprocessingGroup" xmlns:wpi="http://schemas.microsoft.com/office/word/2010/wordprocessingInk" xmlns:wne="http://schemas.microsoft.com/office/word/2006/wordml" xmlns:wps="http://schemas.microsoft.com/office/word/2010/wordprocessingShape" mc:Ignorable="w14 w15 w16se w16cid wp14">
   <w:body>
+    <w:tbl>
+      <w:tblPr>
+        <w:tblW w:type="auto" w:w="0"/>
+        <w:jc w:val="center"/>
+        <w:tblLayout w:type="fixed"/>
+        <w:tblLook w:firstColumn="1" w:firstRow="1" w:lastColumn="0" w:lastRow="0" w:noHBand="0" w:noVBand="1" w:val="04A0"/>
+      </w:tblPr>
+      <w:tblGrid>
+        <w:gridCol w:w="4414"/>
+        <w:gridCol w:w="4414"/>
+      </w:tblGrid>
+      <w:tr>
+        <w:trPr>
+          <w:cantSplit/>
+        </w:trPr>
+        <w:tc>
+          <w:tcPr>
+            <w:tcW w:type="dxa" w:w="8838"/>
+            <w:gridSpan w:val="2"/>
+            <w:shd w:fill="10312B"/>
+            <w:vAlign w:val="center"/>
+          </w:tcPr>
+          <w:p>
+            <w:pPr>
+              <w:keepNext w:val="0"/>
+              <w:widowControl/>
+              <w:spacing w:before="0" w:after="0" w:line="240" w:lineRule="auto"/>
+              <w:jc w:val="center"/>
+            </w:pPr>
+            <w:r/>
+            <w:r>
+              <w:rPr>
+                <w:rFonts w:ascii="Noto Sans" w:hAnsi="Noto Sans"/>
+                <w:b/>
+                <w:i w:val="0"/>
+                <w:color w:val="FFFFFF"/>
+                <w:sz w:val="20"/>
+              </w:rPr>
+              <w:t>Boletín del 28 de octubre de 2026 | INEGI</w:t>
+            </w:r>
+          </w:p>
+        </w:tc>
+      </w:tr>
+      <w:tr>
+        <w:trPr>
+          <w:cantSplit/>
+        </w:trPr>
+        <w:tc>
+          <w:tcPr>
+            <w:tcW w:type="dxa" w:w="8838"/>
+            <w:gridSpan w:val="2"/>
+            <w:shd w:fill="235B4C"/>
+            <w:vAlign w:val="center"/>
+          </w:tcPr>
+          <w:p>
+            <w:pPr>
+              <w:keepNext w:val="0"/>
+              <w:widowControl/>
+              <w:spacing w:before="0" w:after="0" w:line="240" w:lineRule="auto"/>
+              <w:jc w:val="center"/>
+            </w:pPr>
+            <w:r/>
+            <w:r>
+              <w:rPr>
+                <w:rFonts w:ascii="Noto Sans" w:hAnsi="Noto Sans"/>
+                <w:b w:val="0"/>
+                <w:i w:val="0"/>
+                <w:color w:val="FFFFFF"/>
+                <w:sz w:val="22"/>
+              </w:rPr>
+              <w:t>Indicador Mensual Oportuno de la Actividad Manufacturera</w:t>
+            </w:r>
+          </w:p>
+          <w:p>
+            <w:pPr>
+              <w:keepNext w:val="0"/>
+              <w:widowControl/>
+              <w:spacing w:before="0" w:after="0" w:line="240" w:lineRule="auto"/>
+              <w:jc w:val="center"/>
+            </w:pPr>
+            <w:r>
+              <w:rPr>
+                <w:rFonts w:ascii="Noto Sans" w:hAnsi="Noto Sans"/>
+                <w:b/>
+                <w:i w:val="0"/>
+                <w:color w:val="FFFFFF"/>
+                <w:sz w:val="40"/>
+              </w:rPr>
+              <w:t>IMOAM · Septiembre 2026</w:t>
+            </w:r>
+          </w:p>
+        </w:tc>
+      </w:tr>
+      <w:tr>
+        <w:trPr>
+          <w:cantSplit/>
+        </w:trPr>
+        <w:tc>
+          <w:tcPr>
+            <w:tcW w:type="dxa" w:w="4419"/>
+            <w:shd w:fill="538135"/>
+            <w:vAlign w:val="center"/>
+          </w:tcPr>
+          <w:p>
+            <w:pPr>
+              <w:keepNext w:val="0"/>
+              <w:widowControl/>
+              <w:spacing w:before="0" w:after="0" w:line="240" w:lineRule="auto"/>
+              <w:jc w:val="center"/>
+            </w:pPr>
+            <w:r/>
+            <w:r>
+              <w:rPr>
+                <w:rFonts w:ascii="Noto Sans" w:hAnsi="Noto Sans"/>
+                <w:b/>
+                <w:i w:val="0"/>
+                <w:color w:val="FFFFFF"/>
+                <w:sz w:val="19"/>
+              </w:rPr>
+              <w:t>ÍNDICE ESTIMADO</w:t>
+            </w:r>
+          </w:p>
+          <w:p>
+            <w:pPr>
+              <w:keepNext w:val="0"/>
+              <w:widowControl/>
+              <w:spacing w:before="0" w:after="0" w:line="240" w:lineRule="auto"/>
+              <w:jc w:val="center"/>
+            </w:pPr>
+            <w:r>
+              <w:rPr>
+                <w:rFonts w:ascii="Noto Sans" w:hAnsi="Noto Sans"/>
+                <w:b/>
+                <w:i w:val="0"/>
+                <w:color w:val="FFFFFF"/>
+                <w:sz w:val="52"/>
+              </w:rPr>
+              <w:t>108.0</w:t>
+            </w:r>
+          </w:p>
+          <w:p>
+            <w:pPr>
+              <w:keepNext w:val="0"/>
+              <w:widowControl/>
+              <w:spacing w:before="0" w:after="0" w:line="240" w:lineRule="auto"/>
+              <w:jc w:val="center"/>
+            </w:pPr>
+            <w:r>
+              <w:rPr>
+                <w:rFonts w:ascii="Noto Sans" w:hAnsi="Noto Sans"/>
+                <w:b w:val="0"/>
+                <w:i w:val="0"/>
+                <w:color w:val="FFFFFF"/>
+                <w:sz w:val="17"/>
+              </w:rPr>
+              <w:t>Puntos · cifras originales</w:t>
+            </w:r>
+          </w:p>
+        </w:tc>
+        <w:tc>
+          <w:tcPr>
+            <w:tcW w:type="dxa" w:w="4419"/>
+            <w:shd w:fill="538135"/>
+            <w:vAlign w:val="center"/>
+          </w:tcPr>
+          <w:p>
+            <w:pPr>
+              <w:keepNext w:val="0"/>
+              <w:widowControl/>
+              <w:spacing w:before="0" w:after="0" w:line="240" w:lineRule="auto"/>
+              <w:jc w:val="center"/>
+            </w:pPr>
+            <w:r/>
+            <w:r>
+              <w:rPr>
+                <w:rFonts w:ascii="Noto Sans" w:hAnsi="Noto Sans"/>
+                <w:b/>
+                <w:i w:val="0"/>
+                <w:color w:val="FFFFFF"/>
+                <w:sz w:val="19"/>
+              </w:rPr>
+              <w:t>VARIACIÓN ANUAL ESTIMADA</w:t>
+            </w:r>
+          </w:p>
+          <w:p>
+            <w:pPr>
+              <w:keepNext w:val="0"/>
+              <w:widowControl/>
+              <w:spacing w:before="0" w:after="0" w:line="240" w:lineRule="auto"/>
+              <w:jc w:val="center"/>
+            </w:pPr>
+            <w:r>
+              <w:rPr>
+                <w:rFonts w:ascii="Noto Sans" w:hAnsi="Noto Sans"/>
+                <w:b/>
+                <w:i w:val="0"/>
+                <w:color w:val="FFFFFF"/>
+                <w:sz w:val="52"/>
+              </w:rPr>
+              <w:t>1.9%</w:t>
+            </w:r>
+          </w:p>
+          <w:p>
+            <w:pPr>
+              <w:keepNext w:val="0"/>
+              <w:widowControl/>
+              <w:spacing w:before="0" w:after="0" w:line="240" w:lineRule="auto"/>
+              <w:jc w:val="center"/>
+            </w:pPr>
+            <w:r>
+              <w:rPr>
+                <w:rFonts w:ascii="Noto Sans" w:hAnsi="Noto Sans"/>
+                <w:b w:val="0"/>
+                <w:i w:val="0"/>
+                <w:color w:val="FFFFFF"/>
+                <w:sz w:val="17"/>
+              </w:rPr>
+              <w:t>Respecto al mismo mes del año anterior</w:t>
+            </w:r>
+          </w:p>
+        </w:tc>
+      </w:tr>
+    </w:tbl>
     <w:p>
       <w:pPr>
+        <w:keepNext w:val="0"/>
         <w:widowControl/>
         <w:spacing w:before="0" w:after="0" w:line="240" w:lineRule="auto"/>
         <w:jc w:val="both"/>
@@ -12,49 +236,16 @@
         <w:rPr>
           <w:rFonts w:ascii="Noto Sans" w:hAnsi="Noto Sans"/>
           <w:b w:val="0"/>
-          <w:color w:val="000000"/>
+          <w:i/>
+          <w:color w:val="666666"/>
           <w:sz w:val="16"/>
         </w:rPr>
+        <w:t>Nota: estadística experimental. El IMOAM anticipa el IMAI manufacturero; no representa un dato observado definitivo.</w:t>
       </w:r>
     </w:p>
     <w:p>
       <w:pPr>
-        <w:pStyle w:val="Ttulo"/>
-        <w:widowControl/>
-        <w:spacing w:before="0" w:after="0" w:line="240" w:lineRule="auto"/>
-        <w:jc w:val="center"/>
-      </w:pPr>
-      <w:r>
-        <w:rPr>
-          <w:rFonts w:ascii="Noto Sans" w:hAnsi="Noto Sans"/>
-          <w:b/>
-          <w:color w:val="10312B"/>
-          <w:sz w:val="24"/>
-        </w:rPr>
-        <w:t>Indicador Mensual Oportuno de la Actividad Manufacturera</w:t>
-      </w:r>
-    </w:p>
-    <w:p>
-      <w:pPr>
-        <w:widowControl/>
-        <w:spacing w:before="0" w:after="0" w:line="240" w:lineRule="auto"/>
-        <w:jc w:val="center"/>
-        <w:pBdr>
-          <w:bottom w:val="single" w:sz="8" w:space="1" w:color="246454"/>
-        </w:pBdr>
-      </w:pPr>
-      <w:r>
-        <w:rPr>
-          <w:rFonts w:ascii="Noto Sans" w:hAnsi="Noto Sans"/>
-          <w:b/>
-          <w:color w:val="999999"/>
-          <w:sz w:val="22"/>
-        </w:rPr>
-        <w:t>28 de octubre de 2026</w:t>
-      </w:r>
-    </w:p>
-    <w:p>
-      <w:pPr>
+        <w:keepNext w:val="0"/>
         <w:widowControl/>
         <w:spacing w:before="0" w:after="0" w:line="240" w:lineRule="auto"/>
         <w:jc w:val="both"/>
@@ -63,6 +254,7 @@
         <w:rPr>
           <w:rFonts w:ascii="Noto Sans" w:hAnsi="Noto Sans"/>
           <w:b w:val="0"/>
+          <w:i w:val="0"/>
           <w:color w:val="000000"/>
           <w:sz w:val="13"/>
         </w:rPr>
@@ -79,14 +271,16 @@
         <w:rPr>
           <w:rFonts w:ascii="Noto Sans" w:hAnsi="Noto Sans"/>
           <w:b/>
-          <w:color w:val="246454"/>
+          <w:i w:val="0"/>
+          <w:color w:val="235B4C"/>
           <w:sz w:val="22"/>
         </w:rPr>
-        <w:t>Resultados</w:t>
+        <w:t>Resumen ejecutivo</w:t>
       </w:r>
     </w:p>
     <w:p>
       <w:pPr>
+        <w:keepNext w:val="0"/>
         <w:widowControl/>
         <w:spacing w:before="0" w:after="0" w:line="240" w:lineRule="auto"/>
         <w:jc w:val="both"/>
@@ -95,22 +289,97 @@
         <w:rPr>
           <w:rFonts w:ascii="Noto Sans" w:hAnsi="Noto Sans"/>
           <w:b w:val="0"/>
+          <w:i w:val="0"/>
           <w:color w:val="000000"/>
           <w:sz w:val="22"/>
         </w:rPr>
-        <w:t>En septiembre de 2026, el IMOAM estima un aumento de 1.9% respecto al mismo mes del año anterior. El índice estimado se ubicó en 108.0 puntos, a partir de cifras originales.</w:t>
+        <w:t>La estimación puntual apunta a un aumento de la actividad manufacturera en su comparación anual. La lectura debe considerar los intervalos de confianza y el carácter oportuno del indicador.</w:t>
       </w:r>
     </w:p>
     <w:p>
       <w:pPr>
+        <w:pStyle w:val="ListBullet"/>
+        <w:keepNext w:val="0"/>
         <w:widowControl/>
         <w:spacing w:before="0" w:after="0" w:line="240" w:lineRule="auto"/>
+        <w:ind w:left="202" w:hanging="144"/>
         <w:jc w:val="both"/>
+        <w:numPr>
+          <w:ilvl w:val="0"/>
+          <w:numId w:val="36"/>
+        </w:numPr>
       </w:pPr>
       <w:r>
         <w:rPr>
           <w:rFonts w:ascii="Noto Sans" w:hAnsi="Noto Sans"/>
           <w:b w:val="0"/>
+          <w:i w:val="0"/>
+          <w:color w:val="000000"/>
+          <w:sz w:val="22"/>
+        </w:rPr>
+        <w:t>El intervalo anual incluye cero y valores negativos: la señal puntual positiva no implica certeza de crecimiento.</w:t>
+      </w:r>
+    </w:p>
+    <w:p>
+      <w:pPr>
+        <w:pStyle w:val="ListBullet"/>
+        <w:keepNext w:val="0"/>
+        <w:widowControl/>
+        <w:spacing w:before="0" w:after="0" w:line="240" w:lineRule="auto"/>
+        <w:ind w:left="202" w:hanging="144"/>
+        <w:jc w:val="both"/>
+        <w:numPr>
+          <w:ilvl w:val="0"/>
+          <w:numId w:val="36"/>
+        </w:numPr>
+      </w:pPr>
+      <w:r>
+        <w:rPr>
+          <w:rFonts w:ascii="Noto Sans" w:hAnsi="Noto Sans"/>
+          <w:b w:val="0"/>
+          <w:i w:val="0"/>
+          <w:color w:val="000000"/>
+          <w:sz w:val="22"/>
+        </w:rPr>
+        <w:t>La amplitud del intervalo anual es de 5.6 puntos porcentuales; la del índice es de 6.0 puntos.</w:t>
+      </w:r>
+    </w:p>
+    <w:p>
+      <w:pPr>
+        <w:pStyle w:val="ListBullet"/>
+        <w:keepNext w:val="0"/>
+        <w:widowControl/>
+        <w:spacing w:before="0" w:after="0" w:line="240" w:lineRule="auto"/>
+        <w:ind w:left="202" w:hanging="144"/>
+        <w:jc w:val="both"/>
+        <w:numPr>
+          <w:ilvl w:val="0"/>
+          <w:numId w:val="36"/>
+        </w:numPr>
+      </w:pPr>
+      <w:r>
+        <w:rPr>
+          <w:rFonts w:ascii="Noto Sans" w:hAnsi="Noto Sans"/>
+          <w:b w:val="0"/>
+          <w:i w:val="0"/>
+          <w:color w:val="000000"/>
+          <w:sz w:val="22"/>
+        </w:rPr>
+        <w:t>La publicación aporta una lectura anticipada: se difunde alrededor de 18 días antes del IMAI manufacturero, según la ficha metodológica.</w:t>
+      </w:r>
+    </w:p>
+    <w:p>
+      <w:pPr>
+        <w:keepNext w:val="0"/>
+        <w:widowControl/>
+        <w:spacing w:before="0" w:after="0" w:line="240" w:lineRule="auto"/>
+        <w:jc w:val="both"/>
+      </w:pPr>
+      <w:r>
+        <w:rPr>
+          <w:rFonts w:ascii="Noto Sans" w:hAnsi="Noto Sans"/>
+          <w:b w:val="0"/>
+          <w:i w:val="0"/>
           <w:color w:val="000000"/>
           <w:sz w:val="13"/>
         </w:rPr>
@@ -127,14 +396,358 @@
         <w:rPr>
           <w:rFonts w:ascii="Noto Sans" w:hAnsi="Noto Sans"/>
           <w:b/>
-          <w:color w:val="246454"/>
+          <w:i w:val="0"/>
+          <w:color w:val="235B4C"/>
           <w:sz w:val="22"/>
         </w:rPr>
-        <w:t>Incertidumbre de la estimación</w:t>
+        <w:t>Estimación puntual e intervalos de confianza</w:t>
       </w:r>
     </w:p>
+    <w:tbl>
+      <w:tblPr>
+        <w:tblW w:type="auto" w:w="0"/>
+        <w:jc w:val="center"/>
+        <w:tblLayout w:type="fixed"/>
+        <w:tblLook w:firstColumn="1" w:firstRow="1" w:lastColumn="0" w:lastRow="0" w:noHBand="0" w:noVBand="1" w:val="04A0"/>
+      </w:tblPr>
+      <w:tblGrid>
+        <w:gridCol w:w="3384"/>
+        <w:gridCol w:w="1814"/>
+        <w:gridCol w:w="1814"/>
+        <w:gridCol w:w="1814"/>
+      </w:tblGrid>
+      <w:tr>
+        <w:trPr>
+          <w:cantSplit/>
+          <w:tblHeader/>
+        </w:trPr>
+        <w:tc>
+          <w:tcPr>
+            <w:tcW w:type="dxa" w:w="3384"/>
+            <w:shd w:fill="10312B"/>
+            <w:vAlign w:val="center"/>
+          </w:tcPr>
+          <w:p>
+            <w:pPr>
+              <w:keepNext w:val="0"/>
+              <w:widowControl/>
+              <w:spacing w:before="0" w:after="0" w:line="240" w:lineRule="auto"/>
+              <w:jc w:val="left"/>
+            </w:pPr>
+            <w:r/>
+            <w:r>
+              <w:rPr>
+                <w:rFonts w:ascii="Noto Sans" w:hAnsi="Noto Sans"/>
+                <w:b/>
+                <w:i w:val="0"/>
+                <w:color w:val="FFFFFF"/>
+                <w:sz w:val="21"/>
+              </w:rPr>
+              <w:t>Variable</w:t>
+            </w:r>
+          </w:p>
+        </w:tc>
+        <w:tc>
+          <w:tcPr>
+            <w:tcW w:type="dxa" w:w="1814"/>
+            <w:shd w:fill="10312B"/>
+            <w:vAlign w:val="center"/>
+          </w:tcPr>
+          <w:p>
+            <w:pPr>
+              <w:keepNext w:val="0"/>
+              <w:widowControl/>
+              <w:spacing w:before="0" w:after="0" w:line="240" w:lineRule="auto"/>
+              <w:jc w:val="center"/>
+            </w:pPr>
+            <w:r/>
+            <w:r>
+              <w:rPr>
+                <w:rFonts w:ascii="Noto Sans" w:hAnsi="Noto Sans"/>
+                <w:b/>
+                <w:i w:val="0"/>
+                <w:color w:val="FFFFFF"/>
+                <w:sz w:val="21"/>
+              </w:rPr>
+              <w:t>Estimación</w:t>
+            </w:r>
+          </w:p>
+        </w:tc>
+        <w:tc>
+          <w:tcPr>
+            <w:tcW w:type="dxa" w:w="1814"/>
+            <w:shd w:fill="10312B"/>
+            <w:vAlign w:val="center"/>
+          </w:tcPr>
+          <w:p>
+            <w:pPr>
+              <w:keepNext w:val="0"/>
+              <w:widowControl/>
+              <w:spacing w:before="0" w:after="0" w:line="240" w:lineRule="auto"/>
+              <w:jc w:val="center"/>
+            </w:pPr>
+            <w:r/>
+            <w:r>
+              <w:rPr>
+                <w:rFonts w:ascii="Noto Sans" w:hAnsi="Noto Sans"/>
+                <w:b/>
+                <w:i w:val="0"/>
+                <w:color w:val="FFFFFF"/>
+                <w:sz w:val="21"/>
+              </w:rPr>
+              <w:t>Límite inferior</w:t>
+            </w:r>
+          </w:p>
+        </w:tc>
+        <w:tc>
+          <w:tcPr>
+            <w:tcW w:type="dxa" w:w="1814"/>
+            <w:shd w:fill="10312B"/>
+            <w:vAlign w:val="center"/>
+          </w:tcPr>
+          <w:p>
+            <w:pPr>
+              <w:keepNext w:val="0"/>
+              <w:widowControl/>
+              <w:spacing w:before="0" w:after="0" w:line="240" w:lineRule="auto"/>
+              <w:jc w:val="center"/>
+            </w:pPr>
+            <w:r/>
+            <w:r>
+              <w:rPr>
+                <w:rFonts w:ascii="Noto Sans" w:hAnsi="Noto Sans"/>
+                <w:b/>
+                <w:i w:val="0"/>
+                <w:color w:val="FFFFFF"/>
+                <w:sz w:val="21"/>
+              </w:rPr>
+              <w:t>Límite superior</w:t>
+            </w:r>
+          </w:p>
+        </w:tc>
+      </w:tr>
+      <w:tr>
+        <w:trPr>
+          <w:cantSplit/>
+        </w:trPr>
+        <w:tc>
+          <w:tcPr>
+            <w:tcW w:type="dxa" w:w="3384"/>
+            <w:shd w:fill="F4F4F2"/>
+            <w:vAlign w:val="center"/>
+          </w:tcPr>
+          <w:p>
+            <w:pPr>
+              <w:keepNext w:val="0"/>
+              <w:widowControl/>
+              <w:spacing w:before="0" w:after="0" w:line="240" w:lineRule="auto"/>
+              <w:jc w:val="left"/>
+            </w:pPr>
+            <w:r/>
+            <w:r>
+              <w:rPr>
+                <w:rFonts w:ascii="Noto Sans" w:hAnsi="Noto Sans"/>
+                <w:b/>
+                <w:i w:val="0"/>
+                <w:color w:val="000000"/>
+                <w:sz w:val="21"/>
+              </w:rPr>
+              <w:t>Índice (puntos)</w:t>
+            </w:r>
+          </w:p>
+        </w:tc>
+        <w:tc>
+          <w:tcPr>
+            <w:tcW w:type="dxa" w:w="1814"/>
+            <w:shd w:fill="F4F4F2"/>
+            <w:vAlign w:val="center"/>
+          </w:tcPr>
+          <w:p>
+            <w:pPr>
+              <w:keepNext w:val="0"/>
+              <w:widowControl/>
+              <w:spacing w:before="0" w:after="0" w:line="240" w:lineRule="auto"/>
+              <w:jc w:val="center"/>
+            </w:pPr>
+            <w:r/>
+            <w:r>
+              <w:rPr>
+                <w:rFonts w:ascii="Noto Sans" w:hAnsi="Noto Sans"/>
+                <w:b w:val="0"/>
+                <w:i w:val="0"/>
+                <w:color w:val="000000"/>
+                <w:sz w:val="21"/>
+              </w:rPr>
+              <w:t>108.0</w:t>
+            </w:r>
+          </w:p>
+        </w:tc>
+        <w:tc>
+          <w:tcPr>
+            <w:tcW w:type="dxa" w:w="1814"/>
+            <w:shd w:fill="F4F4F2"/>
+            <w:vAlign w:val="center"/>
+          </w:tcPr>
+          <w:p>
+            <w:pPr>
+              <w:keepNext w:val="0"/>
+              <w:widowControl/>
+              <w:spacing w:before="0" w:after="0" w:line="240" w:lineRule="auto"/>
+              <w:jc w:val="center"/>
+            </w:pPr>
+            <w:r/>
+            <w:r>
+              <w:rPr>
+                <w:rFonts w:ascii="Noto Sans" w:hAnsi="Noto Sans"/>
+                <w:b w:val="0"/>
+                <w:i w:val="0"/>
+                <w:color w:val="000000"/>
+                <w:sz w:val="21"/>
+              </w:rPr>
+              <w:t>105.1</w:t>
+            </w:r>
+          </w:p>
+        </w:tc>
+        <w:tc>
+          <w:tcPr>
+            <w:tcW w:type="dxa" w:w="1814"/>
+            <w:shd w:fill="F4F4F2"/>
+            <w:vAlign w:val="center"/>
+          </w:tcPr>
+          <w:p>
+            <w:pPr>
+              <w:keepNext w:val="0"/>
+              <w:widowControl/>
+              <w:spacing w:before="0" w:after="0" w:line="240" w:lineRule="auto"/>
+              <w:jc w:val="center"/>
+            </w:pPr>
+            <w:r/>
+            <w:r>
+              <w:rPr>
+                <w:rFonts w:ascii="Noto Sans" w:hAnsi="Noto Sans"/>
+                <w:b w:val="0"/>
+                <w:i w:val="0"/>
+                <w:color w:val="000000"/>
+                <w:sz w:val="21"/>
+              </w:rPr>
+              <w:t>111.1</w:t>
+            </w:r>
+          </w:p>
+        </w:tc>
+      </w:tr>
+      <w:tr>
+        <w:trPr>
+          <w:cantSplit/>
+        </w:trPr>
+        <w:tc>
+          <w:tcPr>
+            <w:tcW w:type="dxa" w:w="3384"/>
+            <w:shd w:fill="FFFFFF"/>
+            <w:vAlign w:val="center"/>
+          </w:tcPr>
+          <w:p>
+            <w:pPr>
+              <w:keepNext w:val="0"/>
+              <w:widowControl/>
+              <w:spacing w:before="0" w:after="0" w:line="240" w:lineRule="auto"/>
+              <w:jc w:val="left"/>
+            </w:pPr>
+            <w:r/>
+            <w:r>
+              <w:rPr>
+                <w:rFonts w:ascii="Noto Sans" w:hAnsi="Noto Sans"/>
+                <w:b/>
+                <w:i w:val="0"/>
+                <w:color w:val="000000"/>
+                <w:sz w:val="21"/>
+              </w:rPr>
+              <w:t>Variación anual (%)</w:t>
+            </w:r>
+          </w:p>
+        </w:tc>
+        <w:tc>
+          <w:tcPr>
+            <w:tcW w:type="dxa" w:w="1814"/>
+            <w:shd w:fill="FFFFFF"/>
+            <w:vAlign w:val="center"/>
+          </w:tcPr>
+          <w:p>
+            <w:pPr>
+              <w:keepNext w:val="0"/>
+              <w:widowControl/>
+              <w:spacing w:before="0" w:after="0" w:line="240" w:lineRule="auto"/>
+              <w:jc w:val="center"/>
+            </w:pPr>
+            <w:r/>
+            <w:r>
+              <w:rPr>
+                <w:rFonts w:ascii="Noto Sans" w:hAnsi="Noto Sans"/>
+                <w:b w:val="0"/>
+                <w:i w:val="0"/>
+                <w:color w:val="000000"/>
+                <w:sz w:val="21"/>
+              </w:rPr>
+              <w:t>1.9%</w:t>
+            </w:r>
+          </w:p>
+        </w:tc>
+        <w:tc>
+          <w:tcPr>
+            <w:tcW w:type="dxa" w:w="1814"/>
+            <w:shd w:fill="FFFFFF"/>
+            <w:vAlign w:val="center"/>
+          </w:tcPr>
+          <w:p>
+            <w:pPr>
+              <w:keepNext w:val="0"/>
+              <w:widowControl/>
+              <w:spacing w:before="0" w:after="0" w:line="240" w:lineRule="auto"/>
+              <w:jc w:val="center"/>
+            </w:pPr>
+            <w:r/>
+            <w:r>
+              <w:rPr>
+                <w:rFonts w:ascii="Noto Sans" w:hAnsi="Noto Sans"/>
+                <w:b w:val="0"/>
+                <w:i w:val="0"/>
+                <w:color w:val="000000"/>
+                <w:sz w:val="21"/>
+              </w:rPr>
+              <w:t>-0.9%</w:t>
+            </w:r>
+          </w:p>
+        </w:tc>
+        <w:tc>
+          <w:tcPr>
+            <w:tcW w:type="dxa" w:w="1814"/>
+            <w:shd w:fill="FFFFFF"/>
+            <w:vAlign w:val="center"/>
+          </w:tcPr>
+          <w:p>
+            <w:pPr>
+              <w:keepNext w:val="0"/>
+              <w:widowControl/>
+              <w:spacing w:before="0" w:after="0" w:line="240" w:lineRule="auto"/>
+              <w:jc w:val="center"/>
+            </w:pPr>
+            <w:r/>
+            <w:r>
+              <w:rPr>
+                <w:rFonts w:ascii="Noto Sans" w:hAnsi="Noto Sans"/>
+                <w:b w:val="0"/>
+                <w:i w:val="0"/>
+                <w:color w:val="000000"/>
+                <w:sz w:val="21"/>
+              </w:rPr>
+              <w:t>4.7%</w:t>
+            </w:r>
+          </w:p>
+        </w:tc>
+      </w:tr>
+    </w:tbl>
     <w:p>
       <w:pPr>
+        <w:keepNext w:val="0"/>
         <w:widowControl/>
         <w:spacing w:before="0" w:after="0" w:line="240" w:lineRule="auto"/>
         <w:jc w:val="both"/>
@@ -143,21 +756,24 @@
         <w:rPr>
           <w:rFonts w:ascii="Noto Sans" w:hAnsi="Noto Sans"/>
           <w:b w:val="0"/>
-          <w:color w:val="000000"/>
-          <w:sz w:val="22"/>
+          <w:i/>
+          <w:color w:val="666666"/>
+          <w:sz w:val="16"/>
         </w:rPr>
-        <w:t>El intervalo de confianza al 95% de la variación anual incluye cero y valores negativos. La estimación puntual debe leerse junto con esta incertidumbre; no implica certeza sobre el signo del cambio. Para el índice estimado, el intervalo de confianza al 95% va de 105.1 a 111.1 puntos.</w:t>
+        <w:t>IC al 95%. Fuente: INEGI, cuadro 1, página 1. Amplitud = límite superior − límite inferior; cálculo a partir de las cifras publicadas.</w:t>
       </w:r>
     </w:p>
     <w:p>
       <w:pPr>
-        <w:spacing w:after="0" w:before="0"/>
+        <w:keepNext w:val="0"/>
+        <w:widowControl/>
+        <w:spacing w:before="0" w:after="0" w:line="240" w:lineRule="auto"/>
         <w:jc w:val="center"/>
       </w:pPr>
       <w:r>
         <w:drawing>
           <wp:inline xmlns:a="http://schemas.openxmlformats.org/drawingml/2006/main" xmlns:pic="http://schemas.openxmlformats.org/drawingml/2006/picture">
-            <wp:extent cx="5166360" cy="990219"/>
+            <wp:extent cx="5532120" cy="1496393"/>
             <wp:docPr id="1" name="Picture 1"/>
             <wp:cNvGraphicFramePr>
               <a:graphicFrameLocks noChangeAspect="1"/>
@@ -170,7 +786,7 @@
                     <pic:cNvPicPr/>
                   </pic:nvPicPr>
                   <pic:blipFill>
-                    <a:blip r:embed="rId14"/>
+                    <a:blip r:embed="rId9"/>
                     <a:stretch>
                       <a:fillRect/>
                     </a:stretch>
@@ -178,7 +794,7 @@
                   <pic:spPr>
                     <a:xfrm>
                       <a:off x="0" y="0"/>
-                      <a:ext cx="5166360" cy="990219"/>
+                      <a:ext cx="5532120" cy="1496393"/>
                     </a:xfrm>
                     <a:prstGeom prst="rect"/>
                   </pic:spPr>
@@ -191,69 +807,7 @@
     </w:p>
     <w:p>
       <w:pPr>
-        <w:widowControl/>
-        <w:spacing w:before="0" w:after="0" w:line="240" w:lineRule="auto"/>
-        <w:jc w:val="both"/>
-      </w:pPr>
-      <w:r>
-        <w:rPr>
-          <w:rFonts w:ascii="Noto Sans" w:hAnsi="Noto Sans"/>
-          <w:b w:val="0"/>
-          <w:color w:val="000000"/>
-          <w:sz w:val="13"/>
-        </w:rPr>
-      </w:r>
-    </w:p>
-    <w:p>
-      <w:pPr>
-        <w:keepNext/>
-        <w:widowControl/>
-        <w:spacing w:before="0" w:after="0" w:line="240" w:lineRule="auto"/>
-        <w:jc w:val="both"/>
-      </w:pPr>
-      <w:r>
-        <w:rPr>
-          <w:rFonts w:ascii="Noto Sans" w:hAnsi="Noto Sans"/>
-          <w:b/>
-          <w:color w:val="246454"/>
-          <w:sz w:val="22"/>
-        </w:rPr>
-        <w:t>Alcance metodológico</w:t>
-      </w:r>
-    </w:p>
-    <w:p>
-      <w:pPr>
-        <w:widowControl/>
-        <w:spacing w:before="0" w:after="0" w:line="240" w:lineRule="auto"/>
-        <w:jc w:val="both"/>
-      </w:pPr>
-      <w:r>
-        <w:rPr>
-          <w:rFonts w:ascii="Noto Sans" w:hAnsi="Noto Sans"/>
-          <w:b w:val="0"/>
-          <w:color w:val="000000"/>
-          <w:sz w:val="22"/>
-        </w:rPr>
-        <w:t>El IMOAM es una estadística experimental del INEGI que anticipa el IMAI del sector manufacturero. Corresponde a una estimación con cifras originales, sin ajuste estacional; no es un resultado observado del IMAI ni de la EMIM, ni una variación mensual desestacionalizada.</w:t>
-      </w:r>
-    </w:p>
-    <w:p>
-      <w:pPr>
-        <w:widowControl/>
-        <w:spacing w:before="0" w:after="0" w:line="240" w:lineRule="auto"/>
-        <w:jc w:val="both"/>
-      </w:pPr>
-      <w:r>
-        <w:rPr>
-          <w:rFonts w:ascii="Noto Sans" w:hAnsi="Noto Sans"/>
-          <w:b w:val="0"/>
-          <w:color w:val="000000"/>
-          <w:sz w:val="13"/>
-        </w:rPr>
-      </w:r>
-    </w:p>
-    <w:p>
-      <w:pPr>
+        <w:keepNext w:val="0"/>
         <w:widowControl/>
         <w:spacing w:before="0" w:after="0" w:line="240" w:lineRule="auto"/>
         <w:jc w:val="both"/>
@@ -266,11 +820,932 @@
           <w:color w:val="666666"/>
           <w:sz w:val="16"/>
         </w:rPr>
-        <w:t>Fuente: INEGI. Boletín 639/26. Periodo de referencia: septiembre de 2026.</w:t>
+        <w:t>Fuente: INEGI, IMOAM. El punto indica la estimación; el segmento muestra el intervalo al 95%.</w:t>
       </w:r>
     </w:p>
     <w:p>
       <w:pPr>
+        <w:keepNext w:val="0"/>
+        <w:widowControl/>
+        <w:spacing w:before="0" w:after="0" w:line="240" w:lineRule="auto"/>
+        <w:jc w:val="both"/>
+      </w:pPr>
+      <w:r>
+        <w:rPr>
+          <w:rFonts w:ascii="Noto Sans" w:hAnsi="Noto Sans"/>
+          <w:b w:val="0"/>
+          <w:i w:val="0"/>
+          <w:color w:val="000000"/>
+          <w:sz w:val="13"/>
+        </w:rPr>
+      </w:r>
+    </w:p>
+    <w:p>
+      <w:pPr>
+        <w:keepNext/>
+        <w:widowControl/>
+        <w:spacing w:before="0" w:after="0" w:line="240" w:lineRule="auto"/>
+        <w:jc w:val="both"/>
+      </w:pPr>
+      <w:r>
+        <w:rPr>
+          <w:rFonts w:ascii="Noto Sans" w:hAnsi="Noto Sans"/>
+          <w:b/>
+          <w:i w:val="0"/>
+          <w:color w:val="235B4C"/>
+          <w:sz w:val="22"/>
+        </w:rPr>
+        <w:t>Evaluación histórica y oportunidad de publicación</w:t>
+      </w:r>
+    </w:p>
+    <w:p>
+      <w:pPr>
+        <w:keepNext w:val="0"/>
+        <w:widowControl/>
+        <w:spacing w:before="0" w:after="0" w:line="240" w:lineRule="auto"/>
+        <w:jc w:val="both"/>
+      </w:pPr>
+      <w:r>
+        <w:rPr>
+          <w:rFonts w:ascii="Noto Sans" w:hAnsi="Noto Sans"/>
+          <w:b w:val="0"/>
+          <w:i w:val="0"/>
+          <w:color w:val="000000"/>
+          <w:sz w:val="22"/>
+        </w:rPr>
+        <w:t>INEGI reporta que el IMAI manufacturero quedó dentro del intervalo de confianza del IMOAM en 90% de las ocasiones. La comparación presentada en esta edición abarca de enero de 2019 a agosto de 2026.</w:t>
+      </w:r>
+    </w:p>
+    <w:tbl>
+      <w:tblPr>
+        <w:tblW w:type="auto" w:w="0"/>
+        <w:jc w:val="center"/>
+        <w:tblLayout w:type="fixed"/>
+        <w:tblLook w:firstColumn="1" w:firstRow="1" w:lastColumn="0" w:lastRow="0" w:noHBand="0" w:noVBand="1" w:val="04A0"/>
+      </w:tblPr>
+      <w:tblGrid>
+        <w:gridCol w:w="3816"/>
+        <w:gridCol w:w="5011"/>
+      </w:tblGrid>
+      <w:tr>
+        <w:trPr>
+          <w:cantSplit/>
+          <w:tblHeader/>
+        </w:trPr>
+        <w:tc>
+          <w:tcPr>
+            <w:tcW w:type="dxa" w:w="3816"/>
+            <w:shd w:fill="10312B"/>
+            <w:vAlign w:val="center"/>
+          </w:tcPr>
+          <w:p>
+            <w:pPr>
+              <w:keepNext w:val="0"/>
+              <w:widowControl/>
+              <w:spacing w:before="0" w:after="0" w:line="240" w:lineRule="auto"/>
+              <w:jc w:val="left"/>
+            </w:pPr>
+            <w:r/>
+            <w:r>
+              <w:rPr>
+                <w:rFonts w:ascii="Noto Sans" w:hAnsi="Noto Sans"/>
+                <w:b/>
+                <w:i w:val="0"/>
+                <w:color w:val="FFFFFF"/>
+                <w:sz w:val="21"/>
+              </w:rPr>
+              <w:t>Dato de evaluación</w:t>
+            </w:r>
+          </w:p>
+        </w:tc>
+        <w:tc>
+          <w:tcPr>
+            <w:tcW w:type="dxa" w:w="5011"/>
+            <w:shd w:fill="10312B"/>
+            <w:vAlign w:val="center"/>
+          </w:tcPr>
+          <w:p>
+            <w:pPr>
+              <w:keepNext w:val="0"/>
+              <w:widowControl/>
+              <w:spacing w:before="0" w:after="0" w:line="240" w:lineRule="auto"/>
+              <w:jc w:val="center"/>
+            </w:pPr>
+            <w:r/>
+            <w:r>
+              <w:rPr>
+                <w:rFonts w:ascii="Noto Sans" w:hAnsi="Noto Sans"/>
+                <w:b/>
+                <w:i w:val="0"/>
+                <w:color w:val="FFFFFF"/>
+                <w:sz w:val="21"/>
+              </w:rPr>
+              <w:t>Resultado reportado</w:t>
+            </w:r>
+          </w:p>
+        </w:tc>
+      </w:tr>
+      <w:tr>
+        <w:trPr>
+          <w:cantSplit/>
+        </w:trPr>
+        <w:tc>
+          <w:tcPr>
+            <w:tcW w:type="dxa" w:w="3816"/>
+            <w:shd w:fill="F4F4F2"/>
+            <w:vAlign w:val="center"/>
+          </w:tcPr>
+          <w:p>
+            <w:pPr>
+              <w:keepNext w:val="0"/>
+              <w:widowControl/>
+              <w:spacing w:before="0" w:after="0" w:line="240" w:lineRule="auto"/>
+              <w:jc w:val="left"/>
+            </w:pPr>
+            <w:r/>
+            <w:r>
+              <w:rPr>
+                <w:rFonts w:ascii="Noto Sans" w:hAnsi="Noto Sans"/>
+                <w:b/>
+                <w:i w:val="0"/>
+                <w:color w:val="000000"/>
+                <w:sz w:val="21"/>
+              </w:rPr>
+              <w:t>Cobertura histórica del intervalo</w:t>
+            </w:r>
+          </w:p>
+        </w:tc>
+        <w:tc>
+          <w:tcPr>
+            <w:tcW w:type="dxa" w:w="5011"/>
+            <w:shd w:fill="F4F4F2"/>
+            <w:vAlign w:val="center"/>
+          </w:tcPr>
+          <w:p>
+            <w:pPr>
+              <w:keepNext w:val="0"/>
+              <w:widowControl/>
+              <w:spacing w:before="0" w:after="0" w:line="240" w:lineRule="auto"/>
+              <w:jc w:val="center"/>
+            </w:pPr>
+            <w:r/>
+            <w:r>
+              <w:rPr>
+                <w:rFonts w:ascii="Noto Sans" w:hAnsi="Noto Sans"/>
+                <w:b w:val="0"/>
+                <w:i w:val="0"/>
+                <w:color w:val="000000"/>
+                <w:sz w:val="21"/>
+              </w:rPr>
+              <w:t>90% de las ocasiones</w:t>
+            </w:r>
+          </w:p>
+        </w:tc>
+      </w:tr>
+      <w:tr>
+        <w:trPr>
+          <w:cantSplit/>
+        </w:trPr>
+        <w:tc>
+          <w:tcPr>
+            <w:tcW w:type="dxa" w:w="3816"/>
+            <w:shd w:fill="FFFFFF"/>
+            <w:vAlign w:val="center"/>
+          </w:tcPr>
+          <w:p>
+            <w:pPr>
+              <w:keepNext w:val="0"/>
+              <w:widowControl/>
+              <w:spacing w:before="0" w:after="0" w:line="240" w:lineRule="auto"/>
+              <w:jc w:val="left"/>
+            </w:pPr>
+            <w:r/>
+            <w:r>
+              <w:rPr>
+                <w:rFonts w:ascii="Noto Sans" w:hAnsi="Noto Sans"/>
+                <w:b/>
+                <w:i w:val="0"/>
+                <w:color w:val="000000"/>
+                <w:sz w:val="21"/>
+              </w:rPr>
+              <w:t>Inicio del cálculo del IMOAM</w:t>
+            </w:r>
+          </w:p>
+        </w:tc>
+        <w:tc>
+          <w:tcPr>
+            <w:tcW w:type="dxa" w:w="5011"/>
+            <w:shd w:fill="FFFFFF"/>
+            <w:vAlign w:val="center"/>
+          </w:tcPr>
+          <w:p>
+            <w:pPr>
+              <w:keepNext w:val="0"/>
+              <w:widowControl/>
+              <w:spacing w:before="0" w:after="0" w:line="240" w:lineRule="auto"/>
+              <w:jc w:val="center"/>
+            </w:pPr>
+            <w:r/>
+            <w:r>
+              <w:rPr>
+                <w:rFonts w:ascii="Noto Sans" w:hAnsi="Noto Sans"/>
+                <w:b w:val="0"/>
+                <w:i w:val="0"/>
+                <w:color w:val="000000"/>
+                <w:sz w:val="21"/>
+              </w:rPr>
+              <w:t>Agosto de 2015</w:t>
+            </w:r>
+          </w:p>
+        </w:tc>
+      </w:tr>
+      <w:tr>
+        <w:trPr>
+          <w:cantSplit/>
+        </w:trPr>
+        <w:tc>
+          <w:tcPr>
+            <w:tcW w:type="dxa" w:w="3816"/>
+            <w:shd w:fill="F4F4F2"/>
+            <w:vAlign w:val="center"/>
+          </w:tcPr>
+          <w:p>
+            <w:pPr>
+              <w:keepNext w:val="0"/>
+              <w:widowControl/>
+              <w:spacing w:before="0" w:after="0" w:line="240" w:lineRule="auto"/>
+              <w:jc w:val="left"/>
+            </w:pPr>
+            <w:r/>
+            <w:r>
+              <w:rPr>
+                <w:rFonts w:ascii="Noto Sans" w:hAnsi="Noto Sans"/>
+                <w:b/>
+                <w:i w:val="0"/>
+                <w:color w:val="000000"/>
+                <w:sz w:val="21"/>
+              </w:rPr>
+              <w:t>Comparación de referencia</w:t>
+            </w:r>
+          </w:p>
+        </w:tc>
+        <w:tc>
+          <w:tcPr>
+            <w:tcW w:type="dxa" w:w="5011"/>
+            <w:shd w:fill="F4F4F2"/>
+            <w:vAlign w:val="center"/>
+          </w:tcPr>
+          <w:p>
+            <w:pPr>
+              <w:keepNext w:val="0"/>
+              <w:widowControl/>
+              <w:spacing w:before="0" w:after="0" w:line="240" w:lineRule="auto"/>
+              <w:jc w:val="center"/>
+            </w:pPr>
+            <w:r/>
+            <w:r>
+              <w:rPr>
+                <w:rFonts w:ascii="Noto Sans" w:hAnsi="Noto Sans"/>
+                <w:b w:val="0"/>
+                <w:i w:val="0"/>
+                <w:color w:val="000000"/>
+                <w:sz w:val="21"/>
+              </w:rPr>
+              <w:t>IMOAM frente al IMAI del sector manufacturero</w:t>
+            </w:r>
+          </w:p>
+        </w:tc>
+      </w:tr>
+      <w:tr>
+        <w:trPr>
+          <w:cantSplit/>
+        </w:trPr>
+        <w:tc>
+          <w:tcPr>
+            <w:tcW w:type="dxa" w:w="3816"/>
+            <w:shd w:fill="FFFFFF"/>
+            <w:vAlign w:val="center"/>
+          </w:tcPr>
+          <w:p>
+            <w:pPr>
+              <w:keepNext w:val="0"/>
+              <w:widowControl/>
+              <w:spacing w:before="0" w:after="0" w:line="240" w:lineRule="auto"/>
+              <w:jc w:val="left"/>
+            </w:pPr>
+            <w:r/>
+            <w:r>
+              <w:rPr>
+                <w:rFonts w:ascii="Noto Sans" w:hAnsi="Noto Sans"/>
+                <w:b/>
+                <w:i w:val="0"/>
+                <w:color w:val="000000"/>
+                <w:sz w:val="21"/>
+              </w:rPr>
+              <w:t>Nivel nominal del intervalo</w:t>
+            </w:r>
+          </w:p>
+        </w:tc>
+        <w:tc>
+          <w:tcPr>
+            <w:tcW w:type="dxa" w:w="5011"/>
+            <w:shd w:fill="FFFFFF"/>
+            <w:vAlign w:val="center"/>
+          </w:tcPr>
+          <w:p>
+            <w:pPr>
+              <w:keepNext w:val="0"/>
+              <w:widowControl/>
+              <w:spacing w:before="0" w:after="0" w:line="240" w:lineRule="auto"/>
+              <w:jc w:val="center"/>
+            </w:pPr>
+            <w:r/>
+            <w:r>
+              <w:rPr>
+                <w:rFonts w:ascii="Noto Sans" w:hAnsi="Noto Sans"/>
+                <w:b w:val="0"/>
+                <w:i w:val="0"/>
+                <w:color w:val="000000"/>
+                <w:sz w:val="21"/>
+              </w:rPr>
+              <w:t>95% de confianza</w:t>
+            </w:r>
+          </w:p>
+        </w:tc>
+      </w:tr>
+    </w:tbl>
+    <w:p>
+      <w:pPr>
+        <w:keepNext w:val="0"/>
+        <w:widowControl/>
+        <w:spacing w:before="0" w:after="0" w:line="240" w:lineRule="auto"/>
+        <w:jc w:val="both"/>
+      </w:pPr>
+      <w:r>
+        <w:rPr>
+          <w:rFonts w:ascii="Noto Sans" w:hAnsi="Noto Sans"/>
+          <w:b w:val="0"/>
+          <w:i/>
+          <w:color w:val="666666"/>
+          <w:sz w:val="16"/>
+        </w:rPr>
+        <w:t>Fuente: INEGI, evaluación histórica, página 3. La cobertura observada describe desempeño pasado; no es la probabilidad de que la estimación de este mes resulte correcta.</w:t>
+      </w:r>
+    </w:p>
+    <w:p>
+      <w:pPr>
+        <w:keepNext w:val="0"/>
+        <w:widowControl/>
+        <w:spacing w:before="0" w:after="0" w:line="240" w:lineRule="auto"/>
+        <w:jc w:val="center"/>
+      </w:pPr>
+      <w:r>
+        <w:drawing>
+          <wp:inline xmlns:a="http://schemas.openxmlformats.org/drawingml/2006/main" xmlns:pic="http://schemas.openxmlformats.org/drawingml/2006/picture">
+            <wp:extent cx="5532120" cy="1405703"/>
+            <wp:docPr id="2" name="Picture 2"/>
+            <wp:cNvGraphicFramePr>
+              <a:graphicFrameLocks noChangeAspect="1"/>
+            </wp:cNvGraphicFramePr>
+            <a:graphic>
+              <a:graphicData uri="http://schemas.openxmlformats.org/drawingml/2006/picture">
+                <pic:pic>
+                  <pic:nvPicPr>
+                    <pic:cNvPr id="0" name="oportunidad.png"/>
+                    <pic:cNvPicPr/>
+                  </pic:nvPicPr>
+                  <pic:blipFill>
+                    <a:blip r:embed="rId15"/>
+                    <a:stretch>
+                      <a:fillRect/>
+                    </a:stretch>
+                  </pic:blipFill>
+                  <pic:spPr>
+                    <a:xfrm>
+                      <a:off x="0" y="0"/>
+                      <a:ext cx="5532120" cy="1405703"/>
+                    </a:xfrm>
+                    <a:prstGeom prst="rect"/>
+                  </pic:spPr>
+                </pic:pic>
+              </a:graphicData>
+            </a:graphic>
+          </wp:inline>
+        </w:drawing>
+      </w:r>
+    </w:p>
+    <w:p>
+      <w:pPr>
+        <w:keepNext w:val="0"/>
+        <w:widowControl/>
+        <w:spacing w:before="0" w:after="0" w:line="240" w:lineRule="auto"/>
+        <w:jc w:val="both"/>
+      </w:pPr>
+      <w:r>
+        <w:rPr>
+          <w:rFonts w:ascii="Noto Sans" w:hAnsi="Noto Sans"/>
+          <w:b w:val="0"/>
+          <w:i/>
+          <w:color w:val="666666"/>
+          <w:sz w:val="16"/>
+        </w:rPr>
+        <w:t>Fuente: INEGI, ficha metodológica, página 4. Esquema de difusión sin escala temporal exacta; los plazos son aproximados.</w:t>
+      </w:r>
+    </w:p>
+    <w:p>
+      <w:pPr>
+        <w:keepNext w:val="0"/>
+        <w:widowControl/>
+        <w:spacing w:before="0" w:after="0" w:line="240" w:lineRule="auto"/>
+        <w:jc w:val="both"/>
+      </w:pPr>
+      <w:r>
+        <w:rPr>
+          <w:rFonts w:ascii="Noto Sans" w:hAnsi="Noto Sans"/>
+          <w:b w:val="0"/>
+          <w:i w:val="0"/>
+          <w:color w:val="000000"/>
+          <w:sz w:val="13"/>
+        </w:rPr>
+      </w:r>
+    </w:p>
+    <w:p>
+      <w:pPr>
+        <w:keepNext/>
+        <w:widowControl/>
+        <w:spacing w:before="0" w:after="0" w:line="240" w:lineRule="auto"/>
+        <w:jc w:val="both"/>
+      </w:pPr>
+      <w:r>
+        <w:rPr>
+          <w:rFonts w:ascii="Noto Sans" w:hAnsi="Noto Sans"/>
+          <w:b/>
+          <w:i w:val="0"/>
+          <w:color w:val="235B4C"/>
+          <w:sz w:val="22"/>
+        </w:rPr>
+        <w:t>Cobertura y construcción del indicador</w:t>
+      </w:r>
+    </w:p>
+    <w:tbl>
+      <w:tblPr>
+        <w:tblW w:type="auto" w:w="0"/>
+        <w:jc w:val="center"/>
+        <w:tblLayout w:type="fixed"/>
+        <w:tblLook w:firstColumn="1" w:firstRow="1" w:lastColumn="0" w:lastRow="0" w:noHBand="0" w:noVBand="1" w:val="04A0"/>
+      </w:tblPr>
+      <w:tblGrid>
+        <w:gridCol w:w="2952"/>
+        <w:gridCol w:w="5875"/>
+      </w:tblGrid>
+      <w:tr>
+        <w:trPr>
+          <w:cantSplit/>
+          <w:tblHeader/>
+        </w:trPr>
+        <w:tc>
+          <w:tcPr>
+            <w:tcW w:type="dxa" w:w="2952"/>
+            <w:shd w:fill="10312B"/>
+            <w:vAlign w:val="center"/>
+          </w:tcPr>
+          <w:p>
+            <w:pPr>
+              <w:keepNext w:val="0"/>
+              <w:widowControl/>
+              <w:spacing w:before="0" w:after="0" w:line="240" w:lineRule="auto"/>
+              <w:jc w:val="left"/>
+            </w:pPr>
+            <w:r/>
+            <w:r>
+              <w:rPr>
+                <w:rFonts w:ascii="Noto Sans" w:hAnsi="Noto Sans"/>
+                <w:b/>
+                <w:i w:val="0"/>
+                <w:color w:val="FFFFFF"/>
+                <w:sz w:val="21"/>
+              </w:rPr>
+              <w:t>Elemento</w:t>
+            </w:r>
+          </w:p>
+        </w:tc>
+        <w:tc>
+          <w:tcPr>
+            <w:tcW w:type="dxa" w:w="5875"/>
+            <w:shd w:fill="10312B"/>
+            <w:vAlign w:val="center"/>
+          </w:tcPr>
+          <w:p>
+            <w:pPr>
+              <w:keepNext w:val="0"/>
+              <w:widowControl/>
+              <w:spacing w:before="0" w:after="0" w:line="240" w:lineRule="auto"/>
+              <w:jc w:val="center"/>
+            </w:pPr>
+            <w:r/>
+            <w:r>
+              <w:rPr>
+                <w:rFonts w:ascii="Noto Sans" w:hAnsi="Noto Sans"/>
+                <w:b/>
+                <w:i w:val="0"/>
+                <w:color w:val="FFFFFF"/>
+                <w:sz w:val="21"/>
+              </w:rPr>
+              <w:t>Alcance de la edición</w:t>
+            </w:r>
+          </w:p>
+        </w:tc>
+      </w:tr>
+      <w:tr>
+        <w:trPr>
+          <w:cantSplit/>
+        </w:trPr>
+        <w:tc>
+          <w:tcPr>
+            <w:tcW w:type="dxa" w:w="2952"/>
+            <w:shd w:fill="F4F4F2"/>
+            <w:vAlign w:val="center"/>
+          </w:tcPr>
+          <w:p>
+            <w:pPr>
+              <w:keepNext w:val="0"/>
+              <w:widowControl/>
+              <w:spacing w:before="0" w:after="0" w:line="240" w:lineRule="auto"/>
+              <w:jc w:val="left"/>
+            </w:pPr>
+            <w:r/>
+            <w:r>
+              <w:rPr>
+                <w:rFonts w:ascii="Noto Sans" w:hAnsi="Noto Sans"/>
+                <w:b/>
+                <w:i w:val="0"/>
+                <w:color w:val="000000"/>
+                <w:sz w:val="21"/>
+              </w:rPr>
+              <w:t>Unidad de observación</w:t>
+            </w:r>
+          </w:p>
+        </w:tc>
+        <w:tc>
+          <w:tcPr>
+            <w:tcW w:type="dxa" w:w="5875"/>
+            <w:shd w:fill="F4F4F2"/>
+            <w:vAlign w:val="center"/>
+          </w:tcPr>
+          <w:p>
+            <w:pPr>
+              <w:keepNext w:val="0"/>
+              <w:widowControl/>
+              <w:spacing w:before="0" w:after="0" w:line="240" w:lineRule="auto"/>
+              <w:jc w:val="center"/>
+            </w:pPr>
+            <w:r/>
+            <w:r>
+              <w:rPr>
+                <w:rFonts w:ascii="Noto Sans" w:hAnsi="Noto Sans"/>
+                <w:b w:val="0"/>
+                <w:i w:val="0"/>
+                <w:color w:val="000000"/>
+                <w:sz w:val="21"/>
+              </w:rPr>
+              <w:t>Empresa formal en el sector manufacturero de México</w:t>
+            </w:r>
+          </w:p>
+        </w:tc>
+      </w:tr>
+      <w:tr>
+        <w:trPr>
+          <w:cantSplit/>
+        </w:trPr>
+        <w:tc>
+          <w:tcPr>
+            <w:tcW w:type="dxa" w:w="2952"/>
+            <w:shd w:fill="FFFFFF"/>
+            <w:vAlign w:val="center"/>
+          </w:tcPr>
+          <w:p>
+            <w:pPr>
+              <w:keepNext w:val="0"/>
+              <w:widowControl/>
+              <w:spacing w:before="0" w:after="0" w:line="240" w:lineRule="auto"/>
+              <w:jc w:val="left"/>
+            </w:pPr>
+            <w:r/>
+            <w:r>
+              <w:rPr>
+                <w:rFonts w:ascii="Noto Sans" w:hAnsi="Noto Sans"/>
+                <w:b/>
+                <w:i w:val="0"/>
+                <w:color w:val="000000"/>
+                <w:sz w:val="21"/>
+              </w:rPr>
+              <w:t>Variable que se anticipa</w:t>
+            </w:r>
+          </w:p>
+        </w:tc>
+        <w:tc>
+          <w:tcPr>
+            <w:tcW w:type="dxa" w:w="5875"/>
+            <w:shd w:fill="FFFFFF"/>
+            <w:vAlign w:val="center"/>
+          </w:tcPr>
+          <w:p>
+            <w:pPr>
+              <w:keepNext w:val="0"/>
+              <w:widowControl/>
+              <w:spacing w:before="0" w:after="0" w:line="240" w:lineRule="auto"/>
+              <w:jc w:val="center"/>
+            </w:pPr>
+            <w:r/>
+            <w:r>
+              <w:rPr>
+                <w:rFonts w:ascii="Noto Sans" w:hAnsi="Noto Sans"/>
+                <w:b w:val="0"/>
+                <w:i w:val="0"/>
+                <w:color w:val="000000"/>
+                <w:sz w:val="21"/>
+              </w:rPr>
+              <w:t>IMAI del sector manufacturero</w:t>
+            </w:r>
+          </w:p>
+        </w:tc>
+      </w:tr>
+      <w:tr>
+        <w:trPr>
+          <w:cantSplit/>
+        </w:trPr>
+        <w:tc>
+          <w:tcPr>
+            <w:tcW w:type="dxa" w:w="2952"/>
+            <w:shd w:fill="F4F4F2"/>
+            <w:vAlign w:val="center"/>
+          </w:tcPr>
+          <w:p>
+            <w:pPr>
+              <w:keepNext w:val="0"/>
+              <w:widowControl/>
+              <w:spacing w:before="0" w:after="0" w:line="240" w:lineRule="auto"/>
+              <w:jc w:val="left"/>
+            </w:pPr>
+            <w:r/>
+            <w:r>
+              <w:rPr>
+                <w:rFonts w:ascii="Noto Sans" w:hAnsi="Noto Sans"/>
+                <w:b/>
+                <w:i w:val="0"/>
+                <w:color w:val="000000"/>
+                <w:sz w:val="21"/>
+              </w:rPr>
+              <w:t>Insumos del modelo</w:t>
+            </w:r>
+          </w:p>
+        </w:tc>
+        <w:tc>
+          <w:tcPr>
+            <w:tcW w:type="dxa" w:w="5875"/>
+            <w:shd w:fill="F4F4F2"/>
+            <w:vAlign w:val="center"/>
+          </w:tcPr>
+          <w:p>
+            <w:pPr>
+              <w:keepNext w:val="0"/>
+              <w:widowControl/>
+              <w:spacing w:before="0" w:after="0" w:line="240" w:lineRule="auto"/>
+              <w:jc w:val="center"/>
+            </w:pPr>
+            <w:r/>
+            <w:r>
+              <w:rPr>
+                <w:rFonts w:ascii="Noto Sans" w:hAnsi="Noto Sans"/>
+                <w:b w:val="0"/>
+                <w:i w:val="0"/>
+                <w:color w:val="000000"/>
+                <w:sz w:val="21"/>
+              </w:rPr>
+              <w:t>RENEM y registros de consumo de energía eléctrica de CFE y CENACE</w:t>
+            </w:r>
+          </w:p>
+        </w:tc>
+      </w:tr>
+      <w:tr>
+        <w:trPr>
+          <w:cantSplit/>
+        </w:trPr>
+        <w:tc>
+          <w:tcPr>
+            <w:tcW w:type="dxa" w:w="2952"/>
+            <w:shd w:fill="FFFFFF"/>
+            <w:vAlign w:val="center"/>
+          </w:tcPr>
+          <w:p>
+            <w:pPr>
+              <w:keepNext w:val="0"/>
+              <w:widowControl/>
+              <w:spacing w:before="0" w:after="0" w:line="240" w:lineRule="auto"/>
+              <w:jc w:val="left"/>
+            </w:pPr>
+            <w:r/>
+            <w:r>
+              <w:rPr>
+                <w:rFonts w:ascii="Noto Sans" w:hAnsi="Noto Sans"/>
+                <w:b/>
+                <w:i w:val="0"/>
+                <w:color w:val="000000"/>
+                <w:sz w:val="21"/>
+              </w:rPr>
+              <w:t>Tratamiento estadístico</w:t>
+            </w:r>
+          </w:p>
+        </w:tc>
+        <w:tc>
+          <w:tcPr>
+            <w:tcW w:type="dxa" w:w="5875"/>
+            <w:shd w:fill="FFFFFF"/>
+            <w:vAlign w:val="center"/>
+          </w:tcPr>
+          <w:p>
+            <w:pPr>
+              <w:keepNext w:val="0"/>
+              <w:widowControl/>
+              <w:spacing w:before="0" w:after="0" w:line="240" w:lineRule="auto"/>
+              <w:jc w:val="center"/>
+            </w:pPr>
+            <w:r/>
+            <w:r>
+              <w:rPr>
+                <w:rFonts w:ascii="Noto Sans" w:hAnsi="Noto Sans"/>
+                <w:b w:val="0"/>
+                <w:i w:val="0"/>
+                <w:color w:val="000000"/>
+                <w:sz w:val="21"/>
+              </w:rPr>
+              <w:t>Serie mensual original, sin ajuste estacional</w:t>
+            </w:r>
+          </w:p>
+        </w:tc>
+      </w:tr>
+      <w:tr>
+        <w:trPr>
+          <w:cantSplit/>
+        </w:trPr>
+        <w:tc>
+          <w:tcPr>
+            <w:tcW w:type="dxa" w:w="2952"/>
+            <w:shd w:fill="F4F4F2"/>
+            <w:vAlign w:val="center"/>
+          </w:tcPr>
+          <w:p>
+            <w:pPr>
+              <w:keepNext w:val="0"/>
+              <w:widowControl/>
+              <w:spacing w:before="0" w:after="0" w:line="240" w:lineRule="auto"/>
+              <w:jc w:val="left"/>
+            </w:pPr>
+            <w:r/>
+            <w:r>
+              <w:rPr>
+                <w:rFonts w:ascii="Noto Sans" w:hAnsi="Noto Sans"/>
+                <w:b/>
+                <w:i w:val="0"/>
+                <w:color w:val="000000"/>
+                <w:sz w:val="21"/>
+              </w:rPr>
+              <w:t>Disponibilidad de insumos</w:t>
+            </w:r>
+          </w:p>
+        </w:tc>
+        <w:tc>
+          <w:tcPr>
+            <w:tcW w:type="dxa" w:w="5875"/>
+            <w:shd w:fill="F4F4F2"/>
+            <w:vAlign w:val="center"/>
+          </w:tcPr>
+          <w:p>
+            <w:pPr>
+              <w:keepNext w:val="0"/>
+              <w:widowControl/>
+              <w:spacing w:before="0" w:after="0" w:line="240" w:lineRule="auto"/>
+              <w:jc w:val="center"/>
+            </w:pPr>
+            <w:r/>
+            <w:r>
+              <w:rPr>
+                <w:rFonts w:ascii="Noto Sans" w:hAnsi="Noto Sans"/>
+                <w:b w:val="0"/>
+                <w:i w:val="0"/>
+                <w:color w:val="000000"/>
+                <w:sz w:val="21"/>
+              </w:rPr>
+              <w:t>La serie mensual del ICEE no se publica por confidencialidad</w:t>
+            </w:r>
+          </w:p>
+        </w:tc>
+      </w:tr>
+    </w:tbl>
+    <w:p>
+      <w:pPr>
+        <w:keepNext w:val="0"/>
+        <w:widowControl/>
+        <w:spacing w:before="0" w:after="0" w:line="240" w:lineRule="auto"/>
+        <w:jc w:val="both"/>
+      </w:pPr>
+      <w:r>
+        <w:rPr>
+          <w:rFonts w:ascii="Noto Sans" w:hAnsi="Noto Sans"/>
+          <w:b w:val="0"/>
+          <w:i w:val="0"/>
+          <w:color w:val="000000"/>
+          <w:sz w:val="13"/>
+        </w:rPr>
+      </w:r>
+    </w:p>
+    <w:p>
+      <w:pPr>
+        <w:keepNext/>
+        <w:widowControl/>
+        <w:spacing w:before="0" w:after="0" w:line="240" w:lineRule="auto"/>
+        <w:jc w:val="both"/>
+      </w:pPr>
+      <w:r>
+        <w:rPr>
+          <w:rFonts w:ascii="Noto Sans" w:hAnsi="Noto Sans"/>
+          <w:b/>
+          <w:i w:val="0"/>
+          <w:color w:val="235B4C"/>
+          <w:sz w:val="22"/>
+        </w:rPr>
+        <w:t>Notas de interpretación</w:t>
+      </w:r>
+    </w:p>
+    <w:p>
+      <w:pPr>
+        <w:pStyle w:val="ListBullet"/>
+        <w:keepNext w:val="0"/>
+        <w:widowControl/>
+        <w:spacing w:before="0" w:after="0" w:line="240" w:lineRule="auto"/>
+        <w:ind w:left="202" w:hanging="144"/>
+        <w:jc w:val="both"/>
+        <w:numPr>
+          <w:ilvl w:val="0"/>
+          <w:numId w:val="36"/>
+        </w:numPr>
+      </w:pPr>
+      <w:r>
+        <w:rPr>
+          <w:rFonts w:ascii="Noto Sans" w:hAnsi="Noto Sans"/>
+          <w:b w:val="0"/>
+          <w:i w:val="0"/>
+          <w:color w:val="000000"/>
+          <w:sz w:val="22"/>
+        </w:rPr>
+        <w:t>La variación anual compara el mes de referencia con el mismo mes del año anterior; no equivale a una variación mensual desestacionalizada.</w:t>
+      </w:r>
+    </w:p>
+    <w:p>
+      <w:pPr>
+        <w:pStyle w:val="ListBullet"/>
+        <w:keepNext w:val="0"/>
+        <w:widowControl/>
+        <w:spacing w:before="0" w:after="0" w:line="240" w:lineRule="auto"/>
+        <w:ind w:left="202" w:hanging="144"/>
+        <w:jc w:val="both"/>
+        <w:numPr>
+          <w:ilvl w:val="0"/>
+          <w:numId w:val="36"/>
+        </w:numPr>
+      </w:pPr>
+      <w:r>
+        <w:rPr>
+          <w:rFonts w:ascii="Noto Sans" w:hAnsi="Noto Sans"/>
+          <w:b w:val="0"/>
+          <w:i w:val="0"/>
+          <w:color w:val="000000"/>
+          <w:sz w:val="22"/>
+        </w:rPr>
+        <w:t>El IMOAM es una estimación del IMAI manufacturero. No debe confundirse con la EMIM ni atribuirse a ramas o entidades sin un desglose oficial.</w:t>
+      </w:r>
+    </w:p>
+    <w:p>
+      <w:pPr>
+        <w:keepNext w:val="0"/>
+        <w:widowControl/>
+        <w:spacing w:before="0" w:after="0" w:line="240" w:lineRule="auto"/>
+        <w:jc w:val="both"/>
+      </w:pPr>
+      <w:r>
+        <w:rPr>
+          <w:rFonts w:ascii="Noto Sans" w:hAnsi="Noto Sans"/>
+          <w:b w:val="0"/>
+          <w:i/>
+          <w:color w:val="666666"/>
+          <w:sz w:val="16"/>
+        </w:rPr>
+        <w:t>Fuentes: INEGI, boletín 639/26, 28 de octubre de 2026. Resultados e intervalos: p. 1; evaluación histórica: p. 3; metodología: p. 4. El modelo utiliza registros administrativos para ofrecer información oportuna; estos resultados no prueban una relación causal.</w:t>
+      </w:r>
+    </w:p>
+    <w:p>
+      <w:pPr>
+        <w:keepNext w:val="0"/>
         <w:widowControl/>
         <w:spacing w:before="0" w:after="0" w:line="240" w:lineRule="auto"/>
         <w:jc w:val="both"/>
@@ -287,21 +1762,21 @@
       </w:r>
     </w:p>
     <w:sectPr>
-      <w:headerReference w:type="default" r:id="rId9"/>
-      <w:footerReference w:type="even" r:id="rId10"/>
-      <w:footerReference w:type="default" r:id="rId11"/>
+      <w:headerReference w:type="default" r:id="rId10"/>
+      <w:footerReference w:type="even" r:id="rId11"/>
+      <w:footerReference w:type="default" r:id="rId12"/>
       <w:pgSz w:w="12240" w:h="15840"/>
-      <w:pgMar w:top="1417" w:right="1701" w:bottom="1417" w:left="1701" w:header="18" w:footer="23" w:gutter="0"/>
+      <w:pgMar w:top="1134" w:right="1701" w:bottom="1134" w:left="1701" w:header="708" w:footer="708" w:gutter="0"/>
       <w:pgNumType w:start="1"/>
-      <w:cols w:space="720"/>
-      <w:docGrid w:linePitch="326"/>
+      <w:cols w:space="708"/>
+      <w:docGrid w:linePitch="360"/>
     </w:sectPr>
   </w:body>
 </w:document>
 </file>
 
 <file path=word/endnotes.xml><?xml version="1.0" encoding="utf-8"?>
-<w:endnotes xmlns:wpc="http://schemas.microsoft.com/office/word/2010/wordprocessingCanvas" xmlns:cx="http://schemas.microsoft.com/office/drawing/2014/chartex" xmlns:cx1="http://schemas.microsoft.com/office/drawing/2015/9/8/chartex" xmlns:cx2="http://schemas.microsoft.com/office/drawing/2015/10/21/chartex" xmlns:cx3="http://schemas.microsoft.com/office/drawing/2016/5/9/chartex" xmlns:cx4="http://schemas.microsoft.com/office/drawing/2016/5/10/chartex" xmlns:cx5="http://schemas.microsoft.com/office/drawing/2016/5/11/chartex" xmlns:cx6="http://schemas.microsoft.com/office/drawing/2016/5/12/chartex" xmlns:cx7="http://schemas.microsoft.com/office/drawing/2016/5/13/chartex" xmlns:cx8="http://schemas.microsoft.com/office/drawing/2016/5/14/chartex" xmlns:mc="http://schemas.openxmlformats.org/markup-compatibility/2006" xmlns:aink="http://schemas.microsoft.com/office/drawing/2016/ink" xmlns:am3d="http://schemas.microsoft.com/office/drawing/2017/model3d" xmlns:o="urn:schemas-microsoft-com:office:office" xmlns:oel="http://schemas.microsoft.com/office/2019/extlst" xmlns:r="http://schemas.openxmlformats.org/officeDocument/2006/relationships" xmlns:m="http://schemas.openxmlformats.org/officeDocument/2006/math" xmlns:v="urn:schemas-microsoft-com:vml" xmlns:wp14="http://schemas.microsoft.com/office/word/2010/wordprocessingDrawing" xmlns:wp="http://schemas.openxmlformats.org/drawingml/2006/wordprocessingDrawing" xmlns:w10="urn:schemas-microsoft-com:office:word" xmlns:w="http://schemas.openxmlformats.org/wordprocessingml/2006/main" xmlns:w14="http://schemas.microsoft.com/office/word/2010/wordml" xmlns:w15="http://schemas.microsoft.com/office/word/2012/wordml" xmlns:w16cex="http://schemas.microsoft.com/office/word/2018/wordml/cex" xmlns:w16cid="http://schemas.microsoft.com/office/word/2016/wordml/cid" xmlns:w16="http://schemas.microsoft.com/office/word/2018/wordml" xmlns:w16du="http://schemas.microsoft.com/office/word/2023/wordml/word16du" xmlns:w16sdtdh="http://schemas.microsoft.com/office/word/2020/wordml/sdtdatahash" xmlns:w16se="http://schemas.microsoft.com/office/word/2015/wordml/symex" xmlns:wpg="http://schemas.microsoft.com/office/word/2010/wordprocessingGroup" xmlns:wpi="http://schemas.microsoft.com/office/word/2010/wordprocessingInk" xmlns:wne="http://schemas.microsoft.com/office/word/2006/wordml" xmlns:wps="http://schemas.microsoft.com/office/word/2010/wordprocessingShape" mc:Ignorable="w14 w15 w16se w16cid w16 w16cex w16sdtdh w16du wp14">
+<w:endnotes xmlns:wpc="http://schemas.microsoft.com/office/word/2010/wordprocessingCanvas" xmlns:cx="http://schemas.microsoft.com/office/drawing/2014/chartex" xmlns:cx1="http://schemas.microsoft.com/office/drawing/2015/9/8/chartex" xmlns:cx2="http://schemas.microsoft.com/office/drawing/2015/10/21/chartex" xmlns:cx3="http://schemas.microsoft.com/office/drawing/2016/5/9/chartex" xmlns:cx4="http://schemas.microsoft.com/office/drawing/2016/5/10/chartex" xmlns:cx5="http://schemas.microsoft.com/office/drawing/2016/5/11/chartex" xmlns:cx6="http://schemas.microsoft.com/office/drawing/2016/5/12/chartex" xmlns:cx7="http://schemas.microsoft.com/office/drawing/2016/5/13/chartex" xmlns:cx8="http://schemas.microsoft.com/office/drawing/2016/5/14/chartex" xmlns:mc="http://schemas.openxmlformats.org/markup-compatibility/2006" xmlns:aink="http://schemas.microsoft.com/office/drawing/2016/ink" xmlns:am3d="http://schemas.microsoft.com/office/drawing/2017/model3d" xmlns:o="urn:schemas-microsoft-com:office:office" xmlns:r="http://schemas.openxmlformats.org/officeDocument/2006/relationships" xmlns:m="http://schemas.openxmlformats.org/officeDocument/2006/math" xmlns:v="urn:schemas-microsoft-com:vml" xmlns:wp14="http://schemas.microsoft.com/office/word/2010/wordprocessingDrawing" xmlns:wp="http://schemas.openxmlformats.org/drawingml/2006/wordprocessingDrawing" xmlns:w10="urn:schemas-microsoft-com:office:word" xmlns:w="http://schemas.openxmlformats.org/wordprocessingml/2006/main" xmlns:w14="http://schemas.microsoft.com/office/word/2010/wordml" xmlns:w15="http://schemas.microsoft.com/office/word/2012/wordml" xmlns:w16cid="http://schemas.microsoft.com/office/word/2016/wordml/cid" xmlns:w16se="http://schemas.microsoft.com/office/word/2015/wordml/symex" xmlns:wpg="http://schemas.microsoft.com/office/word/2010/wordprocessingGroup" xmlns:wpi="http://schemas.microsoft.com/office/word/2010/wordprocessingInk" xmlns:wne="http://schemas.microsoft.com/office/word/2006/wordml" xmlns:wps="http://schemas.microsoft.com/office/word/2010/wordprocessingShape" mc:Ignorable="w14 w15 w16se w16cid wp14">
   <w:endnote w:type="separator" w:id="-1">
     <w:p>
       <w:r>
@@ -320,7 +1795,7 @@
 </file>
 
 <file path=word/footer1.xml><?xml version="1.0" encoding="utf-8"?>
-<w:ftr xmlns:wpc="http://schemas.microsoft.com/office/word/2010/wordprocessingCanvas" xmlns:cx="http://schemas.microsoft.com/office/drawing/2014/chartex" xmlns:cx1="http://schemas.microsoft.com/office/drawing/2015/9/8/chartex" xmlns:cx2="http://schemas.microsoft.com/office/drawing/2015/10/21/chartex" xmlns:cx3="http://schemas.microsoft.com/office/drawing/2016/5/9/chartex" xmlns:cx4="http://schemas.microsoft.com/office/drawing/2016/5/10/chartex" xmlns:cx5="http://schemas.microsoft.com/office/drawing/2016/5/11/chartex" xmlns:cx6="http://schemas.microsoft.com/office/drawing/2016/5/12/chartex" xmlns:cx7="http://schemas.microsoft.com/office/drawing/2016/5/13/chartex" xmlns:cx8="http://schemas.microsoft.com/office/drawing/2016/5/14/chartex" xmlns:mc="http://schemas.openxmlformats.org/markup-compatibility/2006" xmlns:aink="http://schemas.microsoft.com/office/drawing/2016/ink" xmlns:am3d="http://schemas.microsoft.com/office/drawing/2017/model3d" xmlns:o="urn:schemas-microsoft-com:office:office" xmlns:oel="http://schemas.microsoft.com/office/2019/extlst" xmlns:r="http://schemas.openxmlformats.org/officeDocument/2006/relationships" xmlns:m="http://schemas.openxmlformats.org/officeDocument/2006/math" xmlns:v="urn:schemas-microsoft-com:vml" xmlns:wp14="http://schemas.microsoft.com/office/word/2010/wordprocessingDrawing" xmlns:wp="http://schemas.openxmlformats.org/drawingml/2006/wordprocessingDrawing" xmlns:w10="urn:schemas-microsoft-com:office:word" xmlns:w="http://schemas.openxmlformats.org/wordprocessingml/2006/main" xmlns:w14="http://schemas.microsoft.com/office/word/2010/wordml" xmlns:w15="http://schemas.microsoft.com/office/word/2012/wordml" xmlns:w16cex="http://schemas.microsoft.com/office/word/2018/wordml/cex" xmlns:w16cid="http://schemas.microsoft.com/office/word/2016/wordml/cid" xmlns:w16="http://schemas.microsoft.com/office/word/2018/wordml" xmlns:w16du="http://schemas.microsoft.com/office/word/2023/wordml/word16du" xmlns:w16sdtdh="http://schemas.microsoft.com/office/word/2020/wordml/sdtdatahash" xmlns:w16se="http://schemas.microsoft.com/office/word/2015/wordml/symex" xmlns:wpg="http://schemas.microsoft.com/office/word/2010/wordprocessingGroup" xmlns:wpi="http://schemas.microsoft.com/office/word/2010/wordprocessingInk" xmlns:wne="http://schemas.microsoft.com/office/word/2006/wordml" xmlns:wps="http://schemas.microsoft.com/office/word/2010/wordprocessingShape" mc:Ignorable="w14 w15 w16se w16cid w16 w16cex w16sdtdh w16du wp14">
+<w:ftr xmlns:wpc="http://schemas.microsoft.com/office/word/2010/wordprocessingCanvas" xmlns:cx="http://schemas.microsoft.com/office/drawing/2014/chartex" xmlns:cx1="http://schemas.microsoft.com/office/drawing/2015/9/8/chartex" xmlns:cx2="http://schemas.microsoft.com/office/drawing/2015/10/21/chartex" xmlns:cx3="http://schemas.microsoft.com/office/drawing/2016/5/9/chartex" xmlns:cx4="http://schemas.microsoft.com/office/drawing/2016/5/10/chartex" xmlns:cx5="http://schemas.microsoft.com/office/drawing/2016/5/11/chartex" xmlns:cx6="http://schemas.microsoft.com/office/drawing/2016/5/12/chartex" xmlns:cx7="http://schemas.microsoft.com/office/drawing/2016/5/13/chartex" xmlns:cx8="http://schemas.microsoft.com/office/drawing/2016/5/14/chartex" xmlns:mc="http://schemas.openxmlformats.org/markup-compatibility/2006" xmlns:aink="http://schemas.microsoft.com/office/drawing/2016/ink" xmlns:am3d="http://schemas.microsoft.com/office/drawing/2017/model3d" xmlns:o="urn:schemas-microsoft-com:office:office" xmlns:r="http://schemas.openxmlformats.org/officeDocument/2006/relationships" xmlns:m="http://schemas.openxmlformats.org/officeDocument/2006/math" xmlns:v="urn:schemas-microsoft-com:vml" xmlns:wp14="http://schemas.microsoft.com/office/word/2010/wordprocessingDrawing" xmlns:wp="http://schemas.openxmlformats.org/drawingml/2006/wordprocessingDrawing" xmlns:w10="urn:schemas-microsoft-com:office:word" xmlns:w="http://schemas.openxmlformats.org/wordprocessingml/2006/main" xmlns:w14="http://schemas.microsoft.com/office/word/2010/wordml" xmlns:w15="http://schemas.microsoft.com/office/word/2012/wordml" xmlns:w16cid="http://schemas.microsoft.com/office/word/2016/wordml/cid" xmlns:w16se="http://schemas.microsoft.com/office/word/2015/wordml/symex" xmlns:wpg="http://schemas.microsoft.com/office/word/2010/wordprocessingGroup" xmlns:wpi="http://schemas.microsoft.com/office/word/2010/wordprocessingInk" xmlns:wne="http://schemas.microsoft.com/office/word/2006/wordml" xmlns:wps="http://schemas.microsoft.com/office/word/2010/wordprocessingShape" mc:Ignorable="w14 w15 w16se w16cid wp14">
   <w:sdt>
     <w:sdtPr>
       <w:rPr>
@@ -332,6 +1807,11 @@
         <w:docPartUnique/>
       </w:docPartObj>
     </w:sdtPr>
+    <w:sdtEndPr>
+      <w:rPr>
+        <w:rStyle w:val="Nmerodepgina"/>
+      </w:rPr>
+    </w:sdtEndPr>
     <w:sdtContent>
       <w:p>
         <w:pPr>
@@ -357,6 +1837,19 @@
           <w:rPr>
             <w:rStyle w:val="Nmerodepgina"/>
           </w:rPr>
+          <w:fldChar w:fldCharType="separate"/>
+        </w:r>
+        <w:r>
+          <w:rPr>
+            <w:rStyle w:val="Nmerodepgina"/>
+            <w:noProof/>
+          </w:rPr>
+          <w:t>1</w:t>
+        </w:r>
+        <w:r>
+          <w:rPr>
+            <w:rStyle w:val="Nmerodepgina"/>
+          </w:rPr>
           <w:fldChar w:fldCharType="end"/>
         </w:r>
       </w:p>
@@ -372,7 +1865,7 @@
 </file>
 
 <file path=word/footer2.xml><?xml version="1.0" encoding="utf-8"?>
-<w:ftr xmlns:wpc="http://schemas.microsoft.com/office/word/2010/wordprocessingCanvas" xmlns:cx="http://schemas.microsoft.com/office/drawing/2014/chartex" xmlns:cx1="http://schemas.microsoft.com/office/drawing/2015/9/8/chartex" xmlns:cx2="http://schemas.microsoft.com/office/drawing/2015/10/21/chartex" xmlns:cx3="http://schemas.microsoft.com/office/drawing/2016/5/9/chartex" xmlns:cx4="http://schemas.microsoft.com/office/drawing/2016/5/10/chartex" xmlns:cx5="http://schemas.microsoft.com/office/drawing/2016/5/11/chartex" xmlns:cx6="http://schemas.microsoft.com/office/drawing/2016/5/12/chartex" xmlns:cx7="http://schemas.microsoft.com/office/drawing/2016/5/13/chartex" xmlns:cx8="http://schemas.microsoft.com/office/drawing/2016/5/14/chartex" xmlns:mc="http://schemas.openxmlformats.org/markup-compatibility/2006" xmlns:aink="http://schemas.microsoft.com/office/drawing/2016/ink" xmlns:am3d="http://schemas.microsoft.com/office/drawing/2017/model3d" xmlns:o="urn:schemas-microsoft-com:office:office" xmlns:oel="http://schemas.microsoft.com/office/2019/extlst" xmlns:r="http://schemas.openxmlformats.org/officeDocument/2006/relationships" xmlns:m="http://schemas.openxmlformats.org/officeDocument/2006/math" xmlns:v="urn:schemas-microsoft-com:vml" xmlns:wp14="http://schemas.microsoft.com/office/word/2010/wordprocessingDrawing" xmlns:wp="http://schemas.openxmlformats.org/drawingml/2006/wordprocessingDrawing" xmlns:w10="urn:schemas-microsoft-com:office:word" xmlns:w="http://schemas.openxmlformats.org/wordprocessingml/2006/main" xmlns:w14="http://schemas.microsoft.com/office/word/2010/wordml" xmlns:w15="http://schemas.microsoft.com/office/word/2012/wordml" xmlns:w16cex="http://schemas.microsoft.com/office/word/2018/wordml/cex" xmlns:w16cid="http://schemas.microsoft.com/office/word/2016/wordml/cid" xmlns:w16="http://schemas.microsoft.com/office/word/2018/wordml" xmlns:w16du="http://schemas.microsoft.com/office/word/2023/wordml/word16du" xmlns:w16sdtdh="http://schemas.microsoft.com/office/word/2020/wordml/sdtdatahash" xmlns:w16se="http://schemas.microsoft.com/office/word/2015/wordml/symex" xmlns:wpg="http://schemas.microsoft.com/office/word/2010/wordprocessingGroup" xmlns:wpi="http://schemas.microsoft.com/office/word/2010/wordprocessingInk" xmlns:wne="http://schemas.microsoft.com/office/word/2006/wordml" xmlns:wps="http://schemas.microsoft.com/office/word/2010/wordprocessingShape" mc:Ignorable="w14 w15 w16se w16cid w16 w16cex w16sdtdh w16du wp14">
+<w:ftr xmlns:wpc="http://schemas.microsoft.com/office/word/2010/wordprocessingCanvas" xmlns:cx="http://schemas.microsoft.com/office/drawing/2014/chartex" xmlns:cx1="http://schemas.microsoft.com/office/drawing/2015/9/8/chartex" xmlns:cx2="http://schemas.microsoft.com/office/drawing/2015/10/21/chartex" xmlns:cx3="http://schemas.microsoft.com/office/drawing/2016/5/9/chartex" xmlns:cx4="http://schemas.microsoft.com/office/drawing/2016/5/10/chartex" xmlns:cx5="http://schemas.microsoft.com/office/drawing/2016/5/11/chartex" xmlns:cx6="http://schemas.microsoft.com/office/drawing/2016/5/12/chartex" xmlns:cx7="http://schemas.microsoft.com/office/drawing/2016/5/13/chartex" xmlns:cx8="http://schemas.microsoft.com/office/drawing/2016/5/14/chartex" xmlns:mc="http://schemas.openxmlformats.org/markup-compatibility/2006" xmlns:aink="http://schemas.microsoft.com/office/drawing/2016/ink" xmlns:am3d="http://schemas.microsoft.com/office/drawing/2017/model3d" xmlns:o="urn:schemas-microsoft-com:office:office" xmlns:r="http://schemas.openxmlformats.org/officeDocument/2006/relationships" xmlns:m="http://schemas.openxmlformats.org/officeDocument/2006/math" xmlns:v="urn:schemas-microsoft-com:vml" xmlns:wp14="http://schemas.microsoft.com/office/word/2010/wordprocessingDrawing" xmlns:wp="http://schemas.openxmlformats.org/drawingml/2006/wordprocessingDrawing" xmlns:w10="urn:schemas-microsoft-com:office:word" xmlns:w="http://schemas.openxmlformats.org/wordprocessingml/2006/main" xmlns:w14="http://schemas.microsoft.com/office/word/2010/wordml" xmlns:w15="http://schemas.microsoft.com/office/word/2012/wordml" xmlns:w16cid="http://schemas.microsoft.com/office/word/2016/wordml/cid" xmlns:w16se="http://schemas.microsoft.com/office/word/2015/wordml/symex" xmlns:wpg="http://schemas.microsoft.com/office/word/2010/wordprocessingGroup" xmlns:wpi="http://schemas.microsoft.com/office/word/2010/wordprocessingInk" xmlns:wne="http://schemas.microsoft.com/office/word/2006/wordml" xmlns:wps="http://schemas.microsoft.com/office/word/2010/wordprocessingShape" mc:Ignorable="w14 w15 w16se w16cid wp14">
   <w:p>
     <w:pPr>
       <w:ind w:right="360"/>
@@ -385,16 +1878,16 @@
       <w:drawing>
         <wp:anchor distT="0" distB="0" distL="114300" distR="114300" simplePos="0" relativeHeight="251660288" behindDoc="1" locked="0" layoutInCell="1" allowOverlap="1" wp14:anchorId="093B9EEA" wp14:editId="414DD1FB">
           <wp:simplePos x="0" y="0"/>
-          <wp:positionH relativeFrom="column">
-            <wp:posOffset>-1096177</wp:posOffset>
+          <wp:positionH relativeFrom="page">
+            <wp:posOffset>-121920</wp:posOffset>
           </wp:positionH>
           <wp:positionV relativeFrom="paragraph">
-            <wp:posOffset>-465455</wp:posOffset>
+            <wp:posOffset>-45085</wp:posOffset>
           </wp:positionV>
           <wp:extent cx="7894873" cy="1293628"/>
           <wp:effectExtent l="0" t="0" r="5080" b="1905"/>
           <wp:wrapNone/>
-          <wp:docPr id="441815502" name="Imagen 1" descr="Imagen que contiene Aplicación&#10;&#10;El contenido generado por IA puede ser incorrecto."/>
+          <wp:docPr id="441815502" name="Imagen 1" descr="Imagen que contiene Aplicación  El contenido generado por IA puede ser incorrecto."/>
           <wp:cNvGraphicFramePr>
             <a:graphicFrameLocks xmlns:a="http://schemas.openxmlformats.org/drawingml/2006/main" noChangeAspect="1"/>
           </wp:cNvGraphicFramePr>
@@ -402,7 +1895,7 @@
             <a:graphicData uri="http://schemas.openxmlformats.org/drawingml/2006/picture">
               <pic:pic xmlns:pic="http://schemas.openxmlformats.org/drawingml/2006/picture">
                 <pic:nvPicPr>
-                  <pic:cNvPr id="867835576" name="Imagen 1" descr="Imagen que contiene Aplicación&#10;&#10;El contenido generado por IA puede ser incorrecto."/>
+                  <pic:cNvPr id="867835576" name="Imagen 1" descr="Imagen que contiene Aplicación  El contenido generado por IA puede ser incorrecto."/>
                   <pic:cNvPicPr/>
                 </pic:nvPicPr>
                 <pic:blipFill rotWithShape="1">
@@ -458,7 +1951,7 @@
 </file>
 
 <file path=word/footnotes.xml><?xml version="1.0" encoding="utf-8"?>
-<w:footnotes xmlns:wpc="http://schemas.microsoft.com/office/word/2010/wordprocessingCanvas" xmlns:cx="http://schemas.microsoft.com/office/drawing/2014/chartex" xmlns:cx1="http://schemas.microsoft.com/office/drawing/2015/9/8/chartex" xmlns:cx2="http://schemas.microsoft.com/office/drawing/2015/10/21/chartex" xmlns:cx3="http://schemas.microsoft.com/office/drawing/2016/5/9/chartex" xmlns:cx4="http://schemas.microsoft.com/office/drawing/2016/5/10/chartex" xmlns:cx5="http://schemas.microsoft.com/office/drawing/2016/5/11/chartex" xmlns:cx6="http://schemas.microsoft.com/office/drawing/2016/5/12/chartex" xmlns:cx7="http://schemas.microsoft.com/office/drawing/2016/5/13/chartex" xmlns:cx8="http://schemas.microsoft.com/office/drawing/2016/5/14/chartex" xmlns:mc="http://schemas.openxmlformats.org/markup-compatibility/2006" xmlns:aink="http://schemas.microsoft.com/office/drawing/2016/ink" xmlns:am3d="http://schemas.microsoft.com/office/drawing/2017/model3d" xmlns:o="urn:schemas-microsoft-com:office:office" xmlns:oel="http://schemas.microsoft.com/office/2019/extlst" xmlns:r="http://schemas.openxmlformats.org/officeDocument/2006/relationships" xmlns:m="http://schemas.openxmlformats.org/officeDocument/2006/math" xmlns:v="urn:schemas-microsoft-com:vml" xmlns:wp14="http://schemas.microsoft.com/office/word/2010/wordprocessingDrawing" xmlns:wp="http://schemas.openxmlformats.org/drawingml/2006/wordprocessingDrawing" xmlns:w10="urn:schemas-microsoft-com:office:word" xmlns:w="http://schemas.openxmlformats.org/wordprocessingml/2006/main" xmlns:w14="http://schemas.microsoft.com/office/word/2010/wordml" xmlns:w15="http://schemas.microsoft.com/office/word/2012/wordml" xmlns:w16cex="http://schemas.microsoft.com/office/word/2018/wordml/cex" xmlns:w16cid="http://schemas.microsoft.com/office/word/2016/wordml/cid" xmlns:w16="http://schemas.microsoft.com/office/word/2018/wordml" xmlns:w16du="http://schemas.microsoft.com/office/word/2023/wordml/word16du" xmlns:w16sdtdh="http://schemas.microsoft.com/office/word/2020/wordml/sdtdatahash" xmlns:w16se="http://schemas.microsoft.com/office/word/2015/wordml/symex" xmlns:wpg="http://schemas.microsoft.com/office/word/2010/wordprocessingGroup" xmlns:wpi="http://schemas.microsoft.com/office/word/2010/wordprocessingInk" xmlns:wne="http://schemas.microsoft.com/office/word/2006/wordml" xmlns:wps="http://schemas.microsoft.com/office/word/2010/wordprocessingShape" mc:Ignorable="w14 w15 w16se w16cid w16 w16cex w16sdtdh w16du wp14">
+<w:footnotes xmlns:wpc="http://schemas.microsoft.com/office/word/2010/wordprocessingCanvas" xmlns:cx="http://schemas.microsoft.com/office/drawing/2014/chartex" xmlns:cx1="http://schemas.microsoft.com/office/drawing/2015/9/8/chartex" xmlns:cx2="http://schemas.microsoft.com/office/drawing/2015/10/21/chartex" xmlns:cx3="http://schemas.microsoft.com/office/drawing/2016/5/9/chartex" xmlns:cx4="http://schemas.microsoft.com/office/drawing/2016/5/10/chartex" xmlns:cx5="http://schemas.microsoft.com/office/drawing/2016/5/11/chartex" xmlns:cx6="http://schemas.microsoft.com/office/drawing/2016/5/12/chartex" xmlns:cx7="http://schemas.microsoft.com/office/drawing/2016/5/13/chartex" xmlns:cx8="http://schemas.microsoft.com/office/drawing/2016/5/14/chartex" xmlns:mc="http://schemas.openxmlformats.org/markup-compatibility/2006" xmlns:aink="http://schemas.microsoft.com/office/drawing/2016/ink" xmlns:am3d="http://schemas.microsoft.com/office/drawing/2017/model3d" xmlns:o="urn:schemas-microsoft-com:office:office" xmlns:r="http://schemas.openxmlformats.org/officeDocument/2006/relationships" xmlns:m="http://schemas.openxmlformats.org/officeDocument/2006/math" xmlns:v="urn:schemas-microsoft-com:vml" xmlns:wp14="http://schemas.microsoft.com/office/word/2010/wordprocessingDrawing" xmlns:wp="http://schemas.openxmlformats.org/drawingml/2006/wordprocessingDrawing" xmlns:w10="urn:schemas-microsoft-com:office:word" xmlns:w="http://schemas.openxmlformats.org/wordprocessingml/2006/main" xmlns:w14="http://schemas.microsoft.com/office/word/2010/wordml" xmlns:w15="http://schemas.microsoft.com/office/word/2012/wordml" xmlns:w16cid="http://schemas.microsoft.com/office/word/2016/wordml/cid" xmlns:w16se="http://schemas.microsoft.com/office/word/2015/wordml/symex" xmlns:wpg="http://schemas.microsoft.com/office/word/2010/wordprocessingGroup" xmlns:wpi="http://schemas.microsoft.com/office/word/2010/wordprocessingInk" xmlns:wne="http://schemas.microsoft.com/office/word/2006/wordml" xmlns:wps="http://schemas.microsoft.com/office/word/2010/wordprocessingShape" mc:Ignorable="w14 w15 w16se w16cid wp14">
   <w:footnote w:type="separator" w:id="-1">
     <w:p>
       <w:r>
@@ -477,7 +1970,7 @@
 </file>
 
 <file path=word/header1.xml><?xml version="1.0" encoding="utf-8"?>
-<w:hdr xmlns:wpc="http://schemas.microsoft.com/office/word/2010/wordprocessingCanvas" xmlns:cx="http://schemas.microsoft.com/office/drawing/2014/chartex" xmlns:cx1="http://schemas.microsoft.com/office/drawing/2015/9/8/chartex" xmlns:cx2="http://schemas.microsoft.com/office/drawing/2015/10/21/chartex" xmlns:cx3="http://schemas.microsoft.com/office/drawing/2016/5/9/chartex" xmlns:cx4="http://schemas.microsoft.com/office/drawing/2016/5/10/chartex" xmlns:cx5="http://schemas.microsoft.com/office/drawing/2016/5/11/chartex" xmlns:cx6="http://schemas.microsoft.com/office/drawing/2016/5/12/chartex" xmlns:cx7="http://schemas.microsoft.com/office/drawing/2016/5/13/chartex" xmlns:cx8="http://schemas.microsoft.com/office/drawing/2016/5/14/chartex" xmlns:mc="http://schemas.openxmlformats.org/markup-compatibility/2006" xmlns:aink="http://schemas.microsoft.com/office/drawing/2016/ink" xmlns:am3d="http://schemas.microsoft.com/office/drawing/2017/model3d" xmlns:o="urn:schemas-microsoft-com:office:office" xmlns:oel="http://schemas.microsoft.com/office/2019/extlst" xmlns:r="http://schemas.openxmlformats.org/officeDocument/2006/relationships" xmlns:m="http://schemas.openxmlformats.org/officeDocument/2006/math" xmlns:v="urn:schemas-microsoft-com:vml" xmlns:wp14="http://schemas.microsoft.com/office/word/2010/wordprocessingDrawing" xmlns:wp="http://schemas.openxmlformats.org/drawingml/2006/wordprocessingDrawing" xmlns:w10="urn:schemas-microsoft-com:office:word" xmlns:w="http://schemas.openxmlformats.org/wordprocessingml/2006/main" xmlns:w14="http://schemas.microsoft.com/office/word/2010/wordml" xmlns:w15="http://schemas.microsoft.com/office/word/2012/wordml" xmlns:w16cex="http://schemas.microsoft.com/office/word/2018/wordml/cex" xmlns:w16cid="http://schemas.microsoft.com/office/word/2016/wordml/cid" xmlns:w16="http://schemas.microsoft.com/office/word/2018/wordml" xmlns:w16du="http://schemas.microsoft.com/office/word/2023/wordml/word16du" xmlns:w16sdtdh="http://schemas.microsoft.com/office/word/2020/wordml/sdtdatahash" xmlns:w16se="http://schemas.microsoft.com/office/word/2015/wordml/symex" xmlns:wpg="http://schemas.microsoft.com/office/word/2010/wordprocessingGroup" xmlns:wpi="http://schemas.microsoft.com/office/word/2010/wordprocessingInk" xmlns:wne="http://schemas.microsoft.com/office/word/2006/wordml" xmlns:wps="http://schemas.microsoft.com/office/word/2010/wordprocessingShape" mc:Ignorable="w14 w15 w16se w16cid w16 w16cex w16sdtdh w16du wp14">
+<w:hdr xmlns:wpc="http://schemas.microsoft.com/office/word/2010/wordprocessingCanvas" xmlns:cx="http://schemas.microsoft.com/office/drawing/2014/chartex" xmlns:cx1="http://schemas.microsoft.com/office/drawing/2015/9/8/chartex" xmlns:cx2="http://schemas.microsoft.com/office/drawing/2015/10/21/chartex" xmlns:cx3="http://schemas.microsoft.com/office/drawing/2016/5/9/chartex" xmlns:cx4="http://schemas.microsoft.com/office/drawing/2016/5/10/chartex" xmlns:cx5="http://schemas.microsoft.com/office/drawing/2016/5/11/chartex" xmlns:cx6="http://schemas.microsoft.com/office/drawing/2016/5/12/chartex" xmlns:cx7="http://schemas.microsoft.com/office/drawing/2016/5/13/chartex" xmlns:cx8="http://schemas.microsoft.com/office/drawing/2016/5/14/chartex" xmlns:mc="http://schemas.openxmlformats.org/markup-compatibility/2006" xmlns:aink="http://schemas.microsoft.com/office/drawing/2016/ink" xmlns:am3d="http://schemas.microsoft.com/office/drawing/2017/model3d" xmlns:o="urn:schemas-microsoft-com:office:office" xmlns:r="http://schemas.openxmlformats.org/officeDocument/2006/relationships" xmlns:m="http://schemas.openxmlformats.org/officeDocument/2006/math" xmlns:v="urn:schemas-microsoft-com:vml" xmlns:wp14="http://schemas.microsoft.com/office/word/2010/wordprocessingDrawing" xmlns:wp="http://schemas.openxmlformats.org/drawingml/2006/wordprocessingDrawing" xmlns:w10="urn:schemas-microsoft-com:office:word" xmlns:w="http://schemas.openxmlformats.org/wordprocessingml/2006/main" xmlns:w14="http://schemas.microsoft.com/office/word/2010/wordml" xmlns:w15="http://schemas.microsoft.com/office/word/2012/wordml" xmlns:w16cid="http://schemas.microsoft.com/office/word/2016/wordml/cid" xmlns:w16se="http://schemas.microsoft.com/office/word/2015/wordml/symex" xmlns:wpg="http://schemas.microsoft.com/office/word/2010/wordprocessingGroup" xmlns:wpi="http://schemas.microsoft.com/office/word/2010/wordprocessingInk" xmlns:wne="http://schemas.microsoft.com/office/word/2006/wordml" xmlns:wps="http://schemas.microsoft.com/office/word/2010/wordprocessingShape" mc:Ignorable="w14 w15 w16se w16cid wp14">
   <w:p>
     <w:r>
       <w:rPr>
@@ -487,10 +1980,10 @@
         <wp:anchor distT="0" distB="0" distL="0" distR="0" simplePos="0" relativeHeight="251658240" behindDoc="1" locked="0" layoutInCell="1" hidden="0" allowOverlap="1" wp14:anchorId="3C194DD2" wp14:editId="09349DB6">
           <wp:simplePos x="0" y="0"/>
           <wp:positionH relativeFrom="page">
-            <wp:posOffset>-12701</wp:posOffset>
+            <wp:posOffset>-12700</wp:posOffset>
           </wp:positionH>
           <wp:positionV relativeFrom="paragraph">
-            <wp:posOffset>26670</wp:posOffset>
+            <wp:posOffset>-436626</wp:posOffset>
           </wp:positionV>
           <wp:extent cx="7753939" cy="1257300"/>
           <wp:effectExtent l="0" t="0" r="6350" b="0"/>
@@ -516,7 +2009,7 @@
                 <pic:spPr>
                   <a:xfrm>
                     <a:off x="0" y="0"/>
-                    <a:ext cx="7789281" cy="1263031"/>
+                    <a:ext cx="7753939" cy="1257300"/>
                   </a:xfrm>
                   <a:prstGeom prst="rect">
                     <a:avLst/>
@@ -539,45 +2032,65 @@
   <w:p/>
   <w:p/>
   <w:p/>
-  <w:p/>
-  <w:p/>
   <w:p>
     <w:pPr>
       <w:ind w:left="-426"/>
       <w:rPr>
-        <w:rFonts w:ascii="Noto Sans" w:hAnsi="Noto Sans" w:cs="Noto Sans"/>
+        <w:rFonts w:ascii="Calibri" w:hAnsi="Calibri" w:cs="Calibri"/>
+        <w:b/>
+        <w:sz w:val="22"/>
+      </w:rPr>
+    </w:pPr>
+    <w:r>
+      <w:rPr>
+        <w:rFonts w:ascii="Noto Sans" w:hAnsi="Noto Sans"/>
+        <w:b/>
+        <w:sz w:val="22"/>
+      </w:rPr>
+      <w:t>S</w:t>
+    </w:r>
+    <w:r>
+      <w:rPr>
+        <w:rFonts w:ascii="Noto Sans" w:hAnsi="Noto Sans"/>
+        <w:b/>
+        <w:sz w:val="22"/>
+      </w:rPr>
+      <w:t>ubs</w:t>
+    </w:r>
+    <w:r>
+      <w:rPr>
+        <w:rFonts w:ascii="Noto Sans" w:hAnsi="Noto Sans"/>
+        <w:b/>
+        <w:sz w:val="22"/>
+      </w:rPr>
+      <w:t xml:space="preserve">ecretaría de </w:t>
+    </w:r>
+    <w:r>
+      <w:rPr>
+        <w:rFonts w:ascii="Noto Sans" w:hAnsi="Noto Sans"/>
+        <w:b/>
+        <w:sz w:val="22"/>
+      </w:rPr>
+      <w:t>Industria y Comercio</w:t>
+    </w:r>
+  </w:p>
+  <w:p>
+    <w:pPr>
+      <w:ind w:left="-426"/>
+      <w:rPr>
+        <w:rFonts w:ascii="Calibri" w:hAnsi="Calibri" w:cs="Calibri"/>
         <w:b/>
         <w:bCs/>
         <w:sz w:val="22"/>
         <w:szCs w:val="22"/>
       </w:rPr>
     </w:pPr>
-    <w:r>
-      <w:rPr>
-        <w:rFonts w:ascii="Noto Sans" w:hAnsi="Noto Sans" w:cs="Noto Sans"/>
-        <w:b/>
-        <w:bCs/>
-        <w:sz w:val="22"/>
-        <w:szCs w:val="22"/>
-      </w:rPr>
-      <w:t>Subsecretaría de Industria y Comercio</w:t>
-    </w:r>
-    <w:r>
-      <w:rPr>
-        <w:rFonts w:ascii="Noto Sans" w:hAnsi="Noto Sans" w:cs="Noto Sans"/>
-        <w:b/>
-        <w:bCs/>
-        <w:sz w:val="22"/>
-        <w:szCs w:val="22"/>
-      </w:rPr>
-      <w:t xml:space="preserve"> </w:t>
-    </w:r>
   </w:p>
 </w:hdr>
 </file>
 
 <file path=word/numbering.xml><?xml version="1.0" encoding="utf-8"?>
-<w:numbering xmlns:wpc="http://schemas.microsoft.com/office/word/2010/wordprocessingCanvas" xmlns:cx="http://schemas.microsoft.com/office/drawing/2014/chartex" xmlns:cx1="http://schemas.microsoft.com/office/drawing/2015/9/8/chartex" xmlns:cx2="http://schemas.microsoft.com/office/drawing/2015/10/21/chartex" xmlns:cx3="http://schemas.microsoft.com/office/drawing/2016/5/9/chartex" xmlns:cx4="http://schemas.microsoft.com/office/drawing/2016/5/10/chartex" xmlns:cx5="http://schemas.microsoft.com/office/drawing/2016/5/11/chartex" xmlns:cx6="http://schemas.microsoft.com/office/drawing/2016/5/12/chartex" xmlns:cx7="http://schemas.microsoft.com/office/drawing/2016/5/13/chartex" xmlns:cx8="http://schemas.microsoft.com/office/drawing/2016/5/14/chartex" xmlns:mc="http://schemas.openxmlformats.org/markup-compatibility/2006" xmlns:aink="http://schemas.microsoft.com/office/drawing/2016/ink" xmlns:am3d="http://schemas.microsoft.com/office/drawing/2017/model3d" xmlns:o="urn:schemas-microsoft-com:office:office" xmlns:oel="http://schemas.microsoft.com/office/2019/extlst" xmlns:r="http://schemas.openxmlformats.org/officeDocument/2006/relationships" xmlns:m="http://schemas.openxmlformats.org/officeDocument/2006/math" xmlns:v="urn:schemas-microsoft-com:vml" xmlns:wp14="http://schemas.microsoft.com/office/word/2010/wordprocessingDrawing" xmlns:wp="http://schemas.openxmlformats.org/drawingml/2006/wordprocessingDrawing" xmlns:w10="urn:schemas-microsoft-com:office:word" xmlns:w="http://schemas.openxmlformats.org/wordprocessingml/2006/main" xmlns:w14="http://schemas.microsoft.com/office/word/2010/wordml" xmlns:w15="http://schemas.microsoft.com/office/word/2012/wordml" xmlns:w16cex="http://schemas.microsoft.com/office/word/2018/wordml/cex" xmlns:w16cid="http://schemas.microsoft.com/office/word/2016/wordml/cid" xmlns:w16="http://schemas.microsoft.com/office/word/2018/wordml" xmlns:w16du="http://schemas.microsoft.com/office/word/2023/wordml/word16du" xmlns:w16sdtdh="http://schemas.microsoft.com/office/word/2020/wordml/sdtdatahash" xmlns:w16se="http://schemas.microsoft.com/office/word/2015/wordml/symex" xmlns:wpg="http://schemas.microsoft.com/office/word/2010/wordprocessingGroup" xmlns:wpi="http://schemas.microsoft.com/office/word/2010/wordprocessingInk" xmlns:wne="http://schemas.microsoft.com/office/word/2006/wordml" xmlns:wps="http://schemas.microsoft.com/office/word/2010/wordprocessingShape" mc:Ignorable="w14 w15 w16se w16cid w16 w16cex w16sdtdh w16du wp14">
+<w:numbering xmlns:wpc="http://schemas.microsoft.com/office/word/2010/wordprocessingCanvas" xmlns:cx="http://schemas.microsoft.com/office/drawing/2014/chartex" xmlns:cx1="http://schemas.microsoft.com/office/drawing/2015/9/8/chartex" xmlns:cx2="http://schemas.microsoft.com/office/drawing/2015/10/21/chartex" xmlns:cx3="http://schemas.microsoft.com/office/drawing/2016/5/9/chartex" xmlns:cx4="http://schemas.microsoft.com/office/drawing/2016/5/10/chartex" xmlns:cx5="http://schemas.microsoft.com/office/drawing/2016/5/11/chartex" xmlns:cx6="http://schemas.microsoft.com/office/drawing/2016/5/12/chartex" xmlns:cx7="http://schemas.microsoft.com/office/drawing/2016/5/13/chartex" xmlns:cx8="http://schemas.microsoft.com/office/drawing/2016/5/14/chartex" xmlns:mc="http://schemas.openxmlformats.org/markup-compatibility/2006" xmlns:aink="http://schemas.microsoft.com/office/drawing/2016/ink" xmlns:am3d="http://schemas.microsoft.com/office/drawing/2017/model3d" xmlns:o="urn:schemas-microsoft-com:office:office" xmlns:r="http://schemas.openxmlformats.org/officeDocument/2006/relationships" xmlns:m="http://schemas.openxmlformats.org/officeDocument/2006/math" xmlns:v="urn:schemas-microsoft-com:vml" xmlns:wp14="http://schemas.microsoft.com/office/word/2010/wordprocessingDrawing" xmlns:wp="http://schemas.openxmlformats.org/drawingml/2006/wordprocessingDrawing" xmlns:w10="urn:schemas-microsoft-com:office:word" xmlns:w="http://schemas.openxmlformats.org/wordprocessingml/2006/main" xmlns:w14="http://schemas.microsoft.com/office/word/2010/wordml" xmlns:w15="http://schemas.microsoft.com/office/word/2012/wordml" xmlns:w16cid="http://schemas.microsoft.com/office/word/2016/wordml/cid" xmlns:w16se="http://schemas.microsoft.com/office/word/2015/wordml/symex" xmlns:wpg="http://schemas.microsoft.com/office/word/2010/wordprocessingGroup" xmlns:wpi="http://schemas.microsoft.com/office/word/2010/wordprocessingInk" xmlns:wne="http://schemas.microsoft.com/office/word/2006/wordml" xmlns:wps="http://schemas.microsoft.com/office/word/2010/wordprocessingShape" mc:Ignorable="w14 w15 w16se w16cid wp14">
   <w:abstractNum w:abstractNumId="0" w15:restartNumberingAfterBreak="0">
     <w:nsid w:val="06966058"/>
     <w:multiLevelType w:val="multilevel"/>
@@ -845,6 +2358,119 @@
     </w:lvl>
   </w:abstractNum>
   <w:abstractNum w:abstractNumId="2" w15:restartNumberingAfterBreak="0">
+    <w:nsid w:val="085C74F6"/>
+    <w:multiLevelType w:val="hybridMultilevel"/>
+    <w:tmpl w:val="BD24C636"/>
+    <w:lvl w:ilvl="0" w:tplc="040A0001">
+      <w:start w:val="1"/>
+      <w:numFmt w:val="bullet"/>
+      <w:lvlText w:val=""/>
+      <w:lvlJc w:val="left"/>
+      <w:pPr>
+        <w:ind w:left="864" w:hanging="360"/>
+      </w:pPr>
+      <w:rPr>
+        <w:rFonts w:ascii="Symbol" w:hAnsi="Symbol" w:hint="default"/>
+      </w:rPr>
+    </w:lvl>
+    <w:lvl w:ilvl="1" w:tplc="040A0003" w:tentative="1">
+      <w:start w:val="1"/>
+      <w:numFmt w:val="bullet"/>
+      <w:lvlText w:val="o"/>
+      <w:lvlJc w:val="left"/>
+      <w:pPr>
+        <w:ind w:left="1584" w:hanging="360"/>
+      </w:pPr>
+      <w:rPr>
+        <w:rFonts w:ascii="Courier New" w:hAnsi="Courier New" w:cs="Courier New" w:hint="default"/>
+      </w:rPr>
+    </w:lvl>
+    <w:lvl w:ilvl="2" w:tplc="040A0005" w:tentative="1">
+      <w:start w:val="1"/>
+      <w:numFmt w:val="bullet"/>
+      <w:lvlText w:val=""/>
+      <w:lvlJc w:val="left"/>
+      <w:pPr>
+        <w:ind w:left="2304" w:hanging="360"/>
+      </w:pPr>
+      <w:rPr>
+        <w:rFonts w:ascii="Wingdings" w:hAnsi="Wingdings" w:hint="default"/>
+      </w:rPr>
+    </w:lvl>
+    <w:lvl w:ilvl="3" w:tplc="040A0001" w:tentative="1">
+      <w:start w:val="1"/>
+      <w:numFmt w:val="bullet"/>
+      <w:lvlText w:val=""/>
+      <w:lvlJc w:val="left"/>
+      <w:pPr>
+        <w:ind w:left="3024" w:hanging="360"/>
+      </w:pPr>
+      <w:rPr>
+        <w:rFonts w:ascii="Symbol" w:hAnsi="Symbol" w:hint="default"/>
+      </w:rPr>
+    </w:lvl>
+    <w:lvl w:ilvl="4" w:tplc="040A0003" w:tentative="1">
+      <w:start w:val="1"/>
+      <w:numFmt w:val="bullet"/>
+      <w:lvlText w:val="o"/>
+      <w:lvlJc w:val="left"/>
+      <w:pPr>
+        <w:ind w:left="3744" w:hanging="360"/>
+      </w:pPr>
+      <w:rPr>
+        <w:rFonts w:ascii="Courier New" w:hAnsi="Courier New" w:cs="Courier New" w:hint="default"/>
+      </w:rPr>
+    </w:lvl>
+    <w:lvl w:ilvl="5" w:tplc="040A0005" w:tentative="1">
+      <w:start w:val="1"/>
+      <w:numFmt w:val="bullet"/>
+      <w:lvlText w:val=""/>
+      <w:lvlJc w:val="left"/>
+      <w:pPr>
+        <w:ind w:left="4464" w:hanging="360"/>
+      </w:pPr>
+      <w:rPr>
+        <w:rFonts w:ascii="Wingdings" w:hAnsi="Wingdings" w:hint="default"/>
+      </w:rPr>
+    </w:lvl>
+    <w:lvl w:ilvl="6" w:tplc="040A0001" w:tentative="1">
+      <w:start w:val="1"/>
+      <w:numFmt w:val="bullet"/>
+      <w:lvlText w:val=""/>
+      <w:lvlJc w:val="left"/>
+      <w:pPr>
+        <w:ind w:left="5184" w:hanging="360"/>
+      </w:pPr>
+      <w:rPr>
+        <w:rFonts w:ascii="Symbol" w:hAnsi="Symbol" w:hint="default"/>
+      </w:rPr>
+    </w:lvl>
+    <w:lvl w:ilvl="7" w:tplc="040A0003" w:tentative="1">
+      <w:start w:val="1"/>
+      <w:numFmt w:val="bullet"/>
+      <w:lvlText w:val="o"/>
+      <w:lvlJc w:val="left"/>
+      <w:pPr>
+        <w:ind w:left="5904" w:hanging="360"/>
+      </w:pPr>
+      <w:rPr>
+        <w:rFonts w:ascii="Courier New" w:hAnsi="Courier New" w:cs="Courier New" w:hint="default"/>
+      </w:rPr>
+    </w:lvl>
+    <w:lvl w:ilvl="8" w:tplc="040A0005" w:tentative="1">
+      <w:start w:val="1"/>
+      <w:numFmt w:val="bullet"/>
+      <w:lvlText w:val=""/>
+      <w:lvlJc w:val="left"/>
+      <w:pPr>
+        <w:ind w:left="6624" w:hanging="360"/>
+      </w:pPr>
+      <w:rPr>
+        <w:rFonts w:ascii="Wingdings" w:hAnsi="Wingdings" w:hint="default"/>
+      </w:rPr>
+    </w:lvl>
+  </w:abstractNum>
+  <w:abstractNum w:abstractNumId="3" w15:restartNumberingAfterBreak="0">
     <w:nsid w:val="09B5062C"/>
     <w:multiLevelType w:val="multilevel"/>
     <w:tmpl w:val="E0D4BEBA"/>
@@ -993,7 +2619,7 @@
       </w:rPr>
     </w:lvl>
   </w:abstractNum>
-  <w:abstractNum w:abstractNumId="3" w15:restartNumberingAfterBreak="0">
+  <w:abstractNum w:abstractNumId="4" w15:restartNumberingAfterBreak="0">
     <w:nsid w:val="0E5B75AF"/>
     <w:multiLevelType w:val="multilevel"/>
     <w:tmpl w:val="F990A2DC"/>
@@ -1142,7 +2768,7 @@
       </w:rPr>
     </w:lvl>
   </w:abstractNum>
-  <w:abstractNum w:abstractNumId="4" w15:restartNumberingAfterBreak="0">
+  <w:abstractNum w:abstractNumId="5" w15:restartNumberingAfterBreak="0">
     <w:nsid w:val="10AA051B"/>
     <w:multiLevelType w:val="multilevel"/>
     <w:tmpl w:val="F70C50A6"/>
@@ -1291,7 +2917,7 @@
       </w:rPr>
     </w:lvl>
   </w:abstractNum>
-  <w:abstractNum w:abstractNumId="5" w15:restartNumberingAfterBreak="0">
+  <w:abstractNum w:abstractNumId="6" w15:restartNumberingAfterBreak="0">
     <w:nsid w:val="1AA26045"/>
     <w:multiLevelType w:val="hybridMultilevel"/>
     <w:tmpl w:val="2886F9F4"/>
@@ -1404,7 +3030,7 @@
       </w:rPr>
     </w:lvl>
   </w:abstractNum>
-  <w:abstractNum w:abstractNumId="6" w15:restartNumberingAfterBreak="0">
+  <w:abstractNum w:abstractNumId="7" w15:restartNumberingAfterBreak="0">
     <w:nsid w:val="1C4B1544"/>
     <w:multiLevelType w:val="multilevel"/>
     <w:tmpl w:val="1DC45634"/>
@@ -1553,7 +3179,7 @@
       </w:rPr>
     </w:lvl>
   </w:abstractNum>
-  <w:abstractNum w:abstractNumId="7" w15:restartNumberingAfterBreak="0">
+  <w:abstractNum w:abstractNumId="8" w15:restartNumberingAfterBreak="0">
     <w:nsid w:val="200E7BD5"/>
     <w:multiLevelType w:val="multilevel"/>
     <w:tmpl w:val="E21E2E2C"/>
@@ -1702,7 +3328,7 @@
       </w:rPr>
     </w:lvl>
   </w:abstractNum>
-  <w:abstractNum w:abstractNumId="8" w15:restartNumberingAfterBreak="0">
+  <w:abstractNum w:abstractNumId="9" w15:restartNumberingAfterBreak="0">
     <w:nsid w:val="20470303"/>
     <w:multiLevelType w:val="hybridMultilevel"/>
     <w:tmpl w:val="77764E72"/>
@@ -1815,7 +3441,7 @@
       </w:rPr>
     </w:lvl>
   </w:abstractNum>
-  <w:abstractNum w:abstractNumId="9" w15:restartNumberingAfterBreak="0">
+  <w:abstractNum w:abstractNumId="10" w15:restartNumberingAfterBreak="0">
     <w:nsid w:val="25613076"/>
     <w:multiLevelType w:val="multilevel"/>
     <w:tmpl w:val="DC6000B2"/>
@@ -1964,7 +3590,122 @@
       </w:rPr>
     </w:lvl>
   </w:abstractNum>
-  <w:abstractNum w:abstractNumId="10" w15:restartNumberingAfterBreak="0">
+  <w:abstractNum w:abstractNumId="11" w15:restartNumberingAfterBreak="0">
+    <w:nsid w:val="25637F62"/>
+    <w:multiLevelType w:val="hybridMultilevel"/>
+    <w:tmpl w:val="491E8574"/>
+    <w:lvl w:ilvl="0" w:tplc="47363282">
+      <w:start w:val="1"/>
+      <w:numFmt w:val="bullet"/>
+      <w:lvlText w:val=""/>
+      <w:lvlJc w:val="left"/>
+      <w:pPr>
+        <w:ind w:left="720" w:hanging="360"/>
+      </w:pPr>
+      <w:rPr>
+        <w:rFonts w:ascii="Symbol" w:hAnsi="Symbol" w:hint="default"/>
+        <w:sz w:val="20"/>
+        <w:szCs w:val="20"/>
+      </w:rPr>
+    </w:lvl>
+    <w:lvl w:ilvl="1" w:tplc="040A0003" w:tentative="1">
+      <w:start w:val="1"/>
+      <w:numFmt w:val="bullet"/>
+      <w:lvlText w:val="o"/>
+      <w:lvlJc w:val="left"/>
+      <w:pPr>
+        <w:ind w:left="1440" w:hanging="360"/>
+      </w:pPr>
+      <w:rPr>
+        <w:rFonts w:ascii="Courier New" w:hAnsi="Courier New" w:cs="Courier New" w:hint="default"/>
+      </w:rPr>
+    </w:lvl>
+    <w:lvl w:ilvl="2" w:tplc="040A0005" w:tentative="1">
+      <w:start w:val="1"/>
+      <w:numFmt w:val="bullet"/>
+      <w:lvlText w:val=""/>
+      <w:lvlJc w:val="left"/>
+      <w:pPr>
+        <w:ind w:left="2160" w:hanging="360"/>
+      </w:pPr>
+      <w:rPr>
+        <w:rFonts w:ascii="Wingdings" w:hAnsi="Wingdings" w:hint="default"/>
+      </w:rPr>
+    </w:lvl>
+    <w:lvl w:ilvl="3" w:tplc="040A0001" w:tentative="1">
+      <w:start w:val="1"/>
+      <w:numFmt w:val="bullet"/>
+      <w:lvlText w:val=""/>
+      <w:lvlJc w:val="left"/>
+      <w:pPr>
+        <w:ind w:left="2880" w:hanging="360"/>
+      </w:pPr>
+      <w:rPr>
+        <w:rFonts w:ascii="Symbol" w:hAnsi="Symbol" w:hint="default"/>
+      </w:rPr>
+    </w:lvl>
+    <w:lvl w:ilvl="4" w:tplc="040A0003" w:tentative="1">
+      <w:start w:val="1"/>
+      <w:numFmt w:val="bullet"/>
+      <w:lvlText w:val="o"/>
+      <w:lvlJc w:val="left"/>
+      <w:pPr>
+        <w:ind w:left="3600" w:hanging="360"/>
+      </w:pPr>
+      <w:rPr>
+        <w:rFonts w:ascii="Courier New" w:hAnsi="Courier New" w:cs="Courier New" w:hint="default"/>
+      </w:rPr>
+    </w:lvl>
+    <w:lvl w:ilvl="5" w:tplc="040A0005" w:tentative="1">
+      <w:start w:val="1"/>
+      <w:numFmt w:val="bullet"/>
+      <w:lvlText w:val=""/>
+      <w:lvlJc w:val="left"/>
+      <w:pPr>
+        <w:ind w:left="4320" w:hanging="360"/>
+      </w:pPr>
+      <w:rPr>
+        <w:rFonts w:ascii="Wingdings" w:hAnsi="Wingdings" w:hint="default"/>
+      </w:rPr>
+    </w:lvl>
+    <w:lvl w:ilvl="6" w:tplc="040A0001" w:tentative="1">
+      <w:start w:val="1"/>
+      <w:numFmt w:val="bullet"/>
+      <w:lvlText w:val=""/>
+      <w:lvlJc w:val="left"/>
+      <w:pPr>
+        <w:ind w:left="5040" w:hanging="360"/>
+      </w:pPr>
+      <w:rPr>
+        <w:rFonts w:ascii="Symbol" w:hAnsi="Symbol" w:hint="default"/>
+      </w:rPr>
+    </w:lvl>
+    <w:lvl w:ilvl="7" w:tplc="040A0003" w:tentative="1">
+      <w:start w:val="1"/>
+      <w:numFmt w:val="bullet"/>
+      <w:lvlText w:val="o"/>
+      <w:lvlJc w:val="left"/>
+      <w:pPr>
+        <w:ind w:left="5760" w:hanging="360"/>
+      </w:pPr>
+      <w:rPr>
+        <w:rFonts w:ascii="Courier New" w:hAnsi="Courier New" w:cs="Courier New" w:hint="default"/>
+      </w:rPr>
+    </w:lvl>
+    <w:lvl w:ilvl="8" w:tplc="040A0005" w:tentative="1">
+      <w:start w:val="1"/>
+      <w:numFmt w:val="bullet"/>
+      <w:lvlText w:val=""/>
+      <w:lvlJc w:val="left"/>
+      <w:pPr>
+        <w:ind w:left="6480" w:hanging="360"/>
+      </w:pPr>
+      <w:rPr>
+        <w:rFonts w:ascii="Wingdings" w:hAnsi="Wingdings" w:hint="default"/>
+      </w:rPr>
+    </w:lvl>
+  </w:abstractNum>
+  <w:abstractNum w:abstractNumId="12" w15:restartNumberingAfterBreak="0">
     <w:nsid w:val="27D72D51"/>
     <w:multiLevelType w:val="hybridMultilevel"/>
     <w:tmpl w:val="B27E3374"/>
@@ -2055,7 +3796,119 @@
       </w:pPr>
     </w:lvl>
   </w:abstractNum>
-  <w:abstractNum w:abstractNumId="11" w15:restartNumberingAfterBreak="0">
+  <w:abstractNum w:abstractNumId="13" w15:restartNumberingAfterBreak="0">
+    <w:nsid w:val="297E7B97"/>
+    <w:multiLevelType w:val="hybridMultilevel"/>
+    <w:tmpl w:val="2A4A9C34"/>
+    <w:lvl w:ilvl="0" w:tplc="BE928576">
+      <w:numFmt w:val="bullet"/>
+      <w:lvlText w:val="•"/>
+      <w:lvlJc w:val="left"/>
+      <w:pPr>
+        <w:ind w:left="504" w:hanging="360"/>
+      </w:pPr>
+      <w:rPr>
+        <w:rFonts w:ascii="Arial" w:eastAsia="Times New Roman" w:hAnsi="Arial" w:cs="Arial" w:hint="default"/>
+      </w:rPr>
+    </w:lvl>
+    <w:lvl w:ilvl="1" w:tplc="040A0003" w:tentative="1">
+      <w:start w:val="1"/>
+      <w:numFmt w:val="bullet"/>
+      <w:lvlText w:val="o"/>
+      <w:lvlJc w:val="left"/>
+      <w:pPr>
+        <w:ind w:left="1440" w:hanging="360"/>
+      </w:pPr>
+      <w:rPr>
+        <w:rFonts w:ascii="Courier New" w:hAnsi="Courier New" w:cs="Courier New" w:hint="default"/>
+      </w:rPr>
+    </w:lvl>
+    <w:lvl w:ilvl="2" w:tplc="040A0005" w:tentative="1">
+      <w:start w:val="1"/>
+      <w:numFmt w:val="bullet"/>
+      <w:lvlText w:val=""/>
+      <w:lvlJc w:val="left"/>
+      <w:pPr>
+        <w:ind w:left="2160" w:hanging="360"/>
+      </w:pPr>
+      <w:rPr>
+        <w:rFonts w:ascii="Wingdings" w:hAnsi="Wingdings" w:hint="default"/>
+      </w:rPr>
+    </w:lvl>
+    <w:lvl w:ilvl="3" w:tplc="040A0001" w:tentative="1">
+      <w:start w:val="1"/>
+      <w:numFmt w:val="bullet"/>
+      <w:lvlText w:val=""/>
+      <w:lvlJc w:val="left"/>
+      <w:pPr>
+        <w:ind w:left="2880" w:hanging="360"/>
+      </w:pPr>
+      <w:rPr>
+        <w:rFonts w:ascii="Symbol" w:hAnsi="Symbol" w:hint="default"/>
+      </w:rPr>
+    </w:lvl>
+    <w:lvl w:ilvl="4" w:tplc="040A0003" w:tentative="1">
+      <w:start w:val="1"/>
+      <w:numFmt w:val="bullet"/>
+      <w:lvlText w:val="o"/>
+      <w:lvlJc w:val="left"/>
+      <w:pPr>
+        <w:ind w:left="3600" w:hanging="360"/>
+      </w:pPr>
+      <w:rPr>
+        <w:rFonts w:ascii="Courier New" w:hAnsi="Courier New" w:cs="Courier New" w:hint="default"/>
+      </w:rPr>
+    </w:lvl>
+    <w:lvl w:ilvl="5" w:tplc="040A0005" w:tentative="1">
+      <w:start w:val="1"/>
+      <w:numFmt w:val="bullet"/>
+      <w:lvlText w:val=""/>
+      <w:lvlJc w:val="left"/>
+      <w:pPr>
+        <w:ind w:left="4320" w:hanging="360"/>
+      </w:pPr>
+      <w:rPr>
+        <w:rFonts w:ascii="Wingdings" w:hAnsi="Wingdings" w:hint="default"/>
+      </w:rPr>
+    </w:lvl>
+    <w:lvl w:ilvl="6" w:tplc="040A0001" w:tentative="1">
+      <w:start w:val="1"/>
+      <w:numFmt w:val="bullet"/>
+      <w:lvlText w:val=""/>
+      <w:lvlJc w:val="left"/>
+      <w:pPr>
+        <w:ind w:left="5040" w:hanging="360"/>
+      </w:pPr>
+      <w:rPr>
+        <w:rFonts w:ascii="Symbol" w:hAnsi="Symbol" w:hint="default"/>
+      </w:rPr>
+    </w:lvl>
+    <w:lvl w:ilvl="7" w:tplc="040A0003" w:tentative="1">
+      <w:start w:val="1"/>
+      <w:numFmt w:val="bullet"/>
+      <w:lvlText w:val="o"/>
+      <w:lvlJc w:val="left"/>
+      <w:pPr>
+        <w:ind w:left="5760" w:hanging="360"/>
+      </w:pPr>
+      <w:rPr>
+        <w:rFonts w:ascii="Courier New" w:hAnsi="Courier New" w:cs="Courier New" w:hint="default"/>
+      </w:rPr>
+    </w:lvl>
+    <w:lvl w:ilvl="8" w:tplc="040A0005" w:tentative="1">
+      <w:start w:val="1"/>
+      <w:numFmt w:val="bullet"/>
+      <w:lvlText w:val=""/>
+      <w:lvlJc w:val="left"/>
+      <w:pPr>
+        <w:ind w:left="6480" w:hanging="360"/>
+      </w:pPr>
+      <w:rPr>
+        <w:rFonts w:ascii="Wingdings" w:hAnsi="Wingdings" w:hint="default"/>
+      </w:rPr>
+    </w:lvl>
+  </w:abstractNum>
+  <w:abstractNum w:abstractNumId="14" w15:restartNumberingAfterBreak="0">
     <w:nsid w:val="2B0F28E7"/>
     <w:multiLevelType w:val="multilevel"/>
     <w:tmpl w:val="B01CB7DA"/>
@@ -2172,7 +4025,7 @@
       </w:pPr>
     </w:lvl>
   </w:abstractNum>
-  <w:abstractNum w:abstractNumId="12" w15:restartNumberingAfterBreak="0">
+  <w:abstractNum w:abstractNumId="15" w15:restartNumberingAfterBreak="0">
     <w:nsid w:val="2C0E56A7"/>
     <w:multiLevelType w:val="multilevel"/>
     <w:tmpl w:val="2B92D926"/>
@@ -2289,7 +4142,7 @@
       </w:pPr>
     </w:lvl>
   </w:abstractNum>
-  <w:abstractNum w:abstractNumId="13" w15:restartNumberingAfterBreak="0">
+  <w:abstractNum w:abstractNumId="16" w15:restartNumberingAfterBreak="0">
     <w:nsid w:val="2DF13CCD"/>
     <w:multiLevelType w:val="multilevel"/>
     <w:tmpl w:val="AEEE5E94"/>
@@ -2438,7 +4291,7 @@
       </w:rPr>
     </w:lvl>
   </w:abstractNum>
-  <w:abstractNum w:abstractNumId="14" w15:restartNumberingAfterBreak="0">
+  <w:abstractNum w:abstractNumId="17" w15:restartNumberingAfterBreak="0">
     <w:nsid w:val="327731D8"/>
     <w:multiLevelType w:val="hybridMultilevel"/>
     <w:tmpl w:val="E58CE21C"/>
@@ -2529,7 +4382,7 @@
       </w:pPr>
     </w:lvl>
   </w:abstractNum>
-  <w:abstractNum w:abstractNumId="15" w15:restartNumberingAfterBreak="0">
+  <w:abstractNum w:abstractNumId="18" w15:restartNumberingAfterBreak="0">
     <w:nsid w:val="4D270ACC"/>
     <w:multiLevelType w:val="multilevel"/>
     <w:tmpl w:val="DDDE211C"/>
@@ -2678,7 +4531,7 @@
       </w:rPr>
     </w:lvl>
   </w:abstractNum>
-  <w:abstractNum w:abstractNumId="16" w15:restartNumberingAfterBreak="0">
+  <w:abstractNum w:abstractNumId="19" w15:restartNumberingAfterBreak="0">
     <w:nsid w:val="4F6F1DE7"/>
     <w:multiLevelType w:val="multilevel"/>
     <w:tmpl w:val="AF8E5FCC"/>
@@ -2827,7 +4680,7 @@
       </w:rPr>
     </w:lvl>
   </w:abstractNum>
-  <w:abstractNum w:abstractNumId="17" w15:restartNumberingAfterBreak="0">
+  <w:abstractNum w:abstractNumId="20" w15:restartNumberingAfterBreak="0">
     <w:nsid w:val="56745AEF"/>
     <w:multiLevelType w:val="multilevel"/>
     <w:tmpl w:val="77708CCE"/>
@@ -2940,7 +4793,119 @@
       </w:pPr>
     </w:lvl>
   </w:abstractNum>
-  <w:abstractNum w:abstractNumId="18" w15:restartNumberingAfterBreak="0">
+  <w:abstractNum w:abstractNumId="21" w15:restartNumberingAfterBreak="0">
+    <w:nsid w:val="5A90047D"/>
+    <w:multiLevelType w:val="hybridMultilevel"/>
+    <w:tmpl w:val="A822CF98"/>
+    <w:lvl w:ilvl="0" w:tplc="BE928576">
+      <w:numFmt w:val="bullet"/>
+      <w:lvlText w:val="•"/>
+      <w:lvlJc w:val="left"/>
+      <w:pPr>
+        <w:ind w:left="504" w:hanging="360"/>
+      </w:pPr>
+      <w:rPr>
+        <w:rFonts w:ascii="Arial" w:eastAsia="Times New Roman" w:hAnsi="Arial" w:cs="Arial" w:hint="default"/>
+      </w:rPr>
+    </w:lvl>
+    <w:lvl w:ilvl="1" w:tplc="040A0003" w:tentative="1">
+      <w:start w:val="1"/>
+      <w:numFmt w:val="bullet"/>
+      <w:lvlText w:val="o"/>
+      <w:lvlJc w:val="left"/>
+      <w:pPr>
+        <w:ind w:left="1224" w:hanging="360"/>
+      </w:pPr>
+      <w:rPr>
+        <w:rFonts w:ascii="Courier New" w:hAnsi="Courier New" w:cs="Courier New" w:hint="default"/>
+      </w:rPr>
+    </w:lvl>
+    <w:lvl w:ilvl="2" w:tplc="040A0005" w:tentative="1">
+      <w:start w:val="1"/>
+      <w:numFmt w:val="bullet"/>
+      <w:lvlText w:val=""/>
+      <w:lvlJc w:val="left"/>
+      <w:pPr>
+        <w:ind w:left="1944" w:hanging="360"/>
+      </w:pPr>
+      <w:rPr>
+        <w:rFonts w:ascii="Wingdings" w:hAnsi="Wingdings" w:hint="default"/>
+      </w:rPr>
+    </w:lvl>
+    <w:lvl w:ilvl="3" w:tplc="040A0001" w:tentative="1">
+      <w:start w:val="1"/>
+      <w:numFmt w:val="bullet"/>
+      <w:lvlText w:val=""/>
+      <w:lvlJc w:val="left"/>
+      <w:pPr>
+        <w:ind w:left="2664" w:hanging="360"/>
+      </w:pPr>
+      <w:rPr>
+        <w:rFonts w:ascii="Symbol" w:hAnsi="Symbol" w:hint="default"/>
+      </w:rPr>
+    </w:lvl>
+    <w:lvl w:ilvl="4" w:tplc="040A0003" w:tentative="1">
+      <w:start w:val="1"/>
+      <w:numFmt w:val="bullet"/>
+      <w:lvlText w:val="o"/>
+      <w:lvlJc w:val="left"/>
+      <w:pPr>
+        <w:ind w:left="3384" w:hanging="360"/>
+      </w:pPr>
+      <w:rPr>
+        <w:rFonts w:ascii="Courier New" w:hAnsi="Courier New" w:cs="Courier New" w:hint="default"/>
+      </w:rPr>
+    </w:lvl>
+    <w:lvl w:ilvl="5" w:tplc="040A0005" w:tentative="1">
+      <w:start w:val="1"/>
+      <w:numFmt w:val="bullet"/>
+      <w:lvlText w:val=""/>
+      <w:lvlJc w:val="left"/>
+      <w:pPr>
+        <w:ind w:left="4104" w:hanging="360"/>
+      </w:pPr>
+      <w:rPr>
+        <w:rFonts w:ascii="Wingdings" w:hAnsi="Wingdings" w:hint="default"/>
+      </w:rPr>
+    </w:lvl>
+    <w:lvl w:ilvl="6" w:tplc="040A0001" w:tentative="1">
+      <w:start w:val="1"/>
+      <w:numFmt w:val="bullet"/>
+      <w:lvlText w:val=""/>
+      <w:lvlJc w:val="left"/>
+      <w:pPr>
+        <w:ind w:left="4824" w:hanging="360"/>
+      </w:pPr>
+      <w:rPr>
+        <w:rFonts w:ascii="Symbol" w:hAnsi="Symbol" w:hint="default"/>
+      </w:rPr>
+    </w:lvl>
+    <w:lvl w:ilvl="7" w:tplc="040A0003" w:tentative="1">
+      <w:start w:val="1"/>
+      <w:numFmt w:val="bullet"/>
+      <w:lvlText w:val="o"/>
+      <w:lvlJc w:val="left"/>
+      <w:pPr>
+        <w:ind w:left="5544" w:hanging="360"/>
+      </w:pPr>
+      <w:rPr>
+        <w:rFonts w:ascii="Courier New" w:hAnsi="Courier New" w:cs="Courier New" w:hint="default"/>
+      </w:rPr>
+    </w:lvl>
+    <w:lvl w:ilvl="8" w:tplc="040A0005" w:tentative="1">
+      <w:start w:val="1"/>
+      <w:numFmt w:val="bullet"/>
+      <w:lvlText w:val=""/>
+      <w:lvlJc w:val="left"/>
+      <w:pPr>
+        <w:ind w:left="6264" w:hanging="360"/>
+      </w:pPr>
+      <w:rPr>
+        <w:rFonts w:ascii="Wingdings" w:hAnsi="Wingdings" w:hint="default"/>
+      </w:rPr>
+    </w:lvl>
+  </w:abstractNum>
+  <w:abstractNum w:abstractNumId="22" w15:restartNumberingAfterBreak="0">
     <w:nsid w:val="62203C88"/>
     <w:multiLevelType w:val="multilevel"/>
     <w:tmpl w:val="CC1C08FC"/>
@@ -3089,7 +5054,7 @@
       </w:rPr>
     </w:lvl>
   </w:abstractNum>
-  <w:abstractNum w:abstractNumId="19" w15:restartNumberingAfterBreak="0">
+  <w:abstractNum w:abstractNumId="23" w15:restartNumberingAfterBreak="0">
     <w:nsid w:val="6268072D"/>
     <w:multiLevelType w:val="hybridMultilevel"/>
     <w:tmpl w:val="050879D8"/>
@@ -3202,7 +5167,7 @@
       </w:rPr>
     </w:lvl>
   </w:abstractNum>
-  <w:abstractNum w:abstractNumId="20" w15:restartNumberingAfterBreak="0">
+  <w:abstractNum w:abstractNumId="24" w15:restartNumberingAfterBreak="0">
     <w:nsid w:val="63157499"/>
     <w:multiLevelType w:val="multilevel"/>
     <w:tmpl w:val="C5827E3C"/>
@@ -3319,7 +5284,7 @@
       </w:pPr>
     </w:lvl>
   </w:abstractNum>
-  <w:abstractNum w:abstractNumId="21" w15:restartNumberingAfterBreak="0">
+  <w:abstractNum w:abstractNumId="25" w15:restartNumberingAfterBreak="0">
     <w:nsid w:val="666C00BF"/>
     <w:multiLevelType w:val="multilevel"/>
     <w:tmpl w:val="98102748"/>
@@ -3468,7 +5433,7 @@
       </w:rPr>
     </w:lvl>
   </w:abstractNum>
-  <w:abstractNum w:abstractNumId="22" w15:restartNumberingAfterBreak="0">
+  <w:abstractNum w:abstractNumId="26" w15:restartNumberingAfterBreak="0">
     <w:nsid w:val="697327C8"/>
     <w:multiLevelType w:val="hybridMultilevel"/>
     <w:tmpl w:val="4BBA90AE"/>
@@ -3557,7 +5522,7 @@
       </w:pPr>
     </w:lvl>
   </w:abstractNum>
-  <w:abstractNum w:abstractNumId="23" w15:restartNumberingAfterBreak="0">
+  <w:abstractNum w:abstractNumId="27" w15:restartNumberingAfterBreak="0">
     <w:nsid w:val="6AA16731"/>
     <w:multiLevelType w:val="multilevel"/>
     <w:tmpl w:val="0A640892"/>
@@ -3706,7 +5671,121 @@
       </w:rPr>
     </w:lvl>
   </w:abstractNum>
-  <w:abstractNum w:abstractNumId="24" w15:restartNumberingAfterBreak="0">
+  <w:abstractNum w:abstractNumId="28" w15:restartNumberingAfterBreak="0">
+    <w:nsid w:val="6BB60062"/>
+    <w:multiLevelType w:val="hybridMultilevel"/>
+    <w:tmpl w:val="F4BA4BB8"/>
+    <w:lvl w:ilvl="0" w:tplc="47363282">
+      <w:start w:val="1"/>
+      <w:numFmt w:val="bullet"/>
+      <w:lvlText w:val=""/>
+      <w:lvlJc w:val="left"/>
+      <w:pPr>
+        <w:ind w:left="720" w:hanging="360"/>
+      </w:pPr>
+      <w:rPr>
+        <w:rFonts w:ascii="Symbol" w:hAnsi="Symbol" w:hint="default"/>
+        <w:sz w:val="20"/>
+        <w:szCs w:val="20"/>
+      </w:rPr>
+    </w:lvl>
+    <w:lvl w:ilvl="1" w:tplc="60E2529C">
+      <w:numFmt w:val="bullet"/>
+      <w:lvlText w:val="•"/>
+      <w:lvlJc w:val="left"/>
+      <w:pPr>
+        <w:ind w:left="1440" w:hanging="360"/>
+      </w:pPr>
+      <w:rPr>
+        <w:rFonts w:ascii="Times New Roman" w:eastAsia="Times New Roman" w:hAnsi="Times New Roman" w:cs="Times New Roman" w:hint="default"/>
+      </w:rPr>
+    </w:lvl>
+    <w:lvl w:ilvl="2" w:tplc="040A0005" w:tentative="1">
+      <w:start w:val="1"/>
+      <w:numFmt w:val="bullet"/>
+      <w:lvlText w:val=""/>
+      <w:lvlJc w:val="left"/>
+      <w:pPr>
+        <w:ind w:left="2160" w:hanging="360"/>
+      </w:pPr>
+      <w:rPr>
+        <w:rFonts w:ascii="Wingdings" w:hAnsi="Wingdings" w:hint="default"/>
+      </w:rPr>
+    </w:lvl>
+    <w:lvl w:ilvl="3" w:tplc="040A0001" w:tentative="1">
+      <w:start w:val="1"/>
+      <w:numFmt w:val="bullet"/>
+      <w:lvlText w:val=""/>
+      <w:lvlJc w:val="left"/>
+      <w:pPr>
+        <w:ind w:left="2880" w:hanging="360"/>
+      </w:pPr>
+      <w:rPr>
+        <w:rFonts w:ascii="Symbol" w:hAnsi="Symbol" w:hint="default"/>
+      </w:rPr>
+    </w:lvl>
+    <w:lvl w:ilvl="4" w:tplc="040A0003" w:tentative="1">
+      <w:start w:val="1"/>
+      <w:numFmt w:val="bullet"/>
+      <w:lvlText w:val="o"/>
+      <w:lvlJc w:val="left"/>
+      <w:pPr>
+        <w:ind w:left="3600" w:hanging="360"/>
+      </w:pPr>
+      <w:rPr>
+        <w:rFonts w:ascii="Courier New" w:hAnsi="Courier New" w:cs="Courier New" w:hint="default"/>
+      </w:rPr>
+    </w:lvl>
+    <w:lvl w:ilvl="5" w:tplc="040A0005" w:tentative="1">
+      <w:start w:val="1"/>
+      <w:numFmt w:val="bullet"/>
+      <w:lvlText w:val=""/>
+      <w:lvlJc w:val="left"/>
+      <w:pPr>
+        <w:ind w:left="4320" w:hanging="360"/>
+      </w:pPr>
+      <w:rPr>
+        <w:rFonts w:ascii="Wingdings" w:hAnsi="Wingdings" w:hint="default"/>
+      </w:rPr>
+    </w:lvl>
+    <w:lvl w:ilvl="6" w:tplc="040A0001" w:tentative="1">
+      <w:start w:val="1"/>
+      <w:numFmt w:val="bullet"/>
+      <w:lvlText w:val=""/>
+      <w:lvlJc w:val="left"/>
+      <w:pPr>
+        <w:ind w:left="5040" w:hanging="360"/>
+      </w:pPr>
+      <w:rPr>
+        <w:rFonts w:ascii="Symbol" w:hAnsi="Symbol" w:hint="default"/>
+      </w:rPr>
+    </w:lvl>
+    <w:lvl w:ilvl="7" w:tplc="040A0003" w:tentative="1">
+      <w:start w:val="1"/>
+      <w:numFmt w:val="bullet"/>
+      <w:lvlText w:val="o"/>
+      <w:lvlJc w:val="left"/>
+      <w:pPr>
+        <w:ind w:left="5760" w:hanging="360"/>
+      </w:pPr>
+      <w:rPr>
+        <w:rFonts w:ascii="Courier New" w:hAnsi="Courier New" w:cs="Courier New" w:hint="default"/>
+      </w:rPr>
+    </w:lvl>
+    <w:lvl w:ilvl="8" w:tplc="040A0005" w:tentative="1">
+      <w:start w:val="1"/>
+      <w:numFmt w:val="bullet"/>
+      <w:lvlText w:val=""/>
+      <w:lvlJc w:val="left"/>
+      <w:pPr>
+        <w:ind w:left="6480" w:hanging="360"/>
+      </w:pPr>
+      <w:rPr>
+        <w:rFonts w:ascii="Wingdings" w:hAnsi="Wingdings" w:hint="default"/>
+      </w:rPr>
+    </w:lvl>
+  </w:abstractNum>
+  <w:abstractNum w:abstractNumId="29" w15:restartNumberingAfterBreak="0">
     <w:nsid w:val="6C55585F"/>
     <w:multiLevelType w:val="multilevel"/>
     <w:tmpl w:val="EE748454"/>
@@ -3855,7 +5934,7 @@
       </w:rPr>
     </w:lvl>
   </w:abstractNum>
-  <w:abstractNum w:abstractNumId="25" w15:restartNumberingAfterBreak="0">
+  <w:abstractNum w:abstractNumId="30" w15:restartNumberingAfterBreak="0">
     <w:nsid w:val="6F0F537A"/>
     <w:multiLevelType w:val="multilevel"/>
     <w:tmpl w:val="4F386DC2"/>
@@ -4004,7 +6083,7 @@
       </w:rPr>
     </w:lvl>
   </w:abstractNum>
-  <w:abstractNum w:abstractNumId="26" w15:restartNumberingAfterBreak="0">
+  <w:abstractNum w:abstractNumId="31" w15:restartNumberingAfterBreak="0">
     <w:nsid w:val="78536124"/>
     <w:multiLevelType w:val="multilevel"/>
     <w:tmpl w:val="F65CAF38"/>
@@ -4153,7 +6232,64 @@
       </w:rPr>
     </w:lvl>
   </w:abstractNum>
-  <w:abstractNum w:abstractNumId="27" w15:restartNumberingAfterBreak="0">
+  <w:abstractNum w:abstractNumId="32" w15:restartNumberingAfterBreak="0">
+    <w:nsid w:val="7A1B2C3D"/>
+    <w:multiLevelType w:val="hybridMultilevel"/>
+    <w:tmpl w:val="7A1B2C3E"/>
+    <w:lvl w:ilvl="0" w:tplc="F266E762">
+      <w:start w:val="1"/>
+      <w:numFmt w:val="bullet"/>
+      <w:lvlText w:val=""/>
+      <w:lvlJc w:val="left"/>
+      <w:pPr>
+        <w:ind w:left="432" w:hanging="288"/>
+      </w:pPr>
+      <w:rPr>
+        <w:rFonts w:ascii="Symbol" w:hAnsi="Symbol" w:hint="default"/>
+      </w:rPr>
+    </w:lvl>
+    <w:lvl w:ilvl="1" w:tplc="1A44F988">
+      <w:numFmt w:val="decimal"/>
+      <w:lvlText w:val=""/>
+      <w:lvlJc w:val="left"/>
+    </w:lvl>
+    <w:lvl w:ilvl="2" w:tplc="784A313A">
+      <w:numFmt w:val="decimal"/>
+      <w:lvlText w:val=""/>
+      <w:lvlJc w:val="left"/>
+    </w:lvl>
+    <w:lvl w:ilvl="3" w:tplc="E940B9BA">
+      <w:numFmt w:val="decimal"/>
+      <w:lvlText w:val=""/>
+      <w:lvlJc w:val="left"/>
+    </w:lvl>
+    <w:lvl w:ilvl="4" w:tplc="CE9E15B0">
+      <w:numFmt w:val="decimal"/>
+      <w:lvlText w:val=""/>
+      <w:lvlJc w:val="left"/>
+    </w:lvl>
+    <w:lvl w:ilvl="5" w:tplc="803CE1A8">
+      <w:numFmt w:val="decimal"/>
+      <w:lvlText w:val=""/>
+      <w:lvlJc w:val="left"/>
+    </w:lvl>
+    <w:lvl w:ilvl="6" w:tplc="7EBEE4BC">
+      <w:numFmt w:val="decimal"/>
+      <w:lvlText w:val=""/>
+      <w:lvlJc w:val="left"/>
+    </w:lvl>
+    <w:lvl w:ilvl="7" w:tplc="AD3C62DA">
+      <w:numFmt w:val="decimal"/>
+      <w:lvlText w:val=""/>
+      <w:lvlJc w:val="left"/>
+    </w:lvl>
+    <w:lvl w:ilvl="8" w:tplc="C35E76F4">
+      <w:numFmt w:val="decimal"/>
+      <w:lvlText w:val=""/>
+      <w:lvlJc w:val="left"/>
+    </w:lvl>
+  </w:abstractNum>
+  <w:abstractNum w:abstractNumId="33" w15:restartNumberingAfterBreak="0">
     <w:nsid w:val="7B7C15D2"/>
     <w:multiLevelType w:val="hybridMultilevel"/>
     <w:tmpl w:val="9E941162"/>
@@ -4266,7 +6402,7 @@
       </w:rPr>
     </w:lvl>
   </w:abstractNum>
-  <w:abstractNum w:abstractNumId="28" w15:restartNumberingAfterBreak="0">
+  <w:abstractNum w:abstractNumId="34" w15:restartNumberingAfterBreak="0">
     <w:nsid w:val="7B7C1AA1"/>
     <w:multiLevelType w:val="multilevel"/>
     <w:tmpl w:val="749C23E2"/>
@@ -4415,99 +6551,129 @@
       </w:rPr>
     </w:lvl>
   </w:abstractNum>
-  <w:num w:numId="1" w16cid:durableId="739328723">
+  <w:num w:numId="1">
+    <w:abstractNumId w:val="17"/>
+  </w:num>
+  <w:num w:numId="2">
+    <w:abstractNumId w:val="6"/>
+  </w:num>
+  <w:num w:numId="3">
+    <w:abstractNumId w:val="20"/>
+  </w:num>
+  <w:num w:numId="4">
+    <w:abstractNumId w:val="34"/>
+  </w:num>
+  <w:num w:numId="5">
+    <w:abstractNumId w:val="27"/>
+  </w:num>
+  <w:num w:numId="6">
+    <w:abstractNumId w:val="10"/>
+  </w:num>
+  <w:num w:numId="7">
+    <w:abstractNumId w:val="30"/>
+  </w:num>
+  <w:num w:numId="8">
+    <w:abstractNumId w:val="8"/>
+  </w:num>
+  <w:num w:numId="9">
+    <w:abstractNumId w:val="5"/>
+  </w:num>
+  <w:num w:numId="10">
+    <w:abstractNumId w:val="16"/>
+  </w:num>
+  <w:num w:numId="11">
+    <w:abstractNumId w:val="19"/>
+  </w:num>
+  <w:num w:numId="12">
+    <w:abstractNumId w:val="18"/>
+  </w:num>
+  <w:num w:numId="13">
+    <w:abstractNumId w:val="7"/>
+  </w:num>
+  <w:num w:numId="14">
     <w:abstractNumId w:val="14"/>
   </w:num>
-  <w:num w:numId="2" w16cid:durableId="913777493">
-    <w:abstractNumId w:val="5"/>
+  <w:num w:numId="15">
+    <w:abstractNumId w:val="31"/>
   </w:num>
-  <w:num w:numId="3" w16cid:durableId="527565843">
-    <w:abstractNumId w:val="17"/>
+  <w:num w:numId="16">
+    <w:abstractNumId w:val="0"/>
   </w:num>
-  <w:num w:numId="4" w16cid:durableId="4791963">
+  <w:num w:numId="17">
+    <w:abstractNumId w:val="24"/>
+  </w:num>
+  <w:num w:numId="18">
+    <w:abstractNumId w:val="15"/>
+  </w:num>
+  <w:num w:numId="19">
+    <w:abstractNumId w:val="23"/>
+  </w:num>
+  <w:num w:numId="20">
+    <w:abstractNumId w:val="26"/>
+  </w:num>
+  <w:num w:numId="21">
+    <w:abstractNumId w:val="12"/>
+  </w:num>
+  <w:num w:numId="22">
+    <w:abstractNumId w:val="1"/>
+  </w:num>
+  <w:num w:numId="23">
+    <w:abstractNumId w:val="22"/>
+  </w:num>
+  <w:num w:numId="24">
+    <w:abstractNumId w:val="25"/>
+  </w:num>
+  <w:num w:numId="25">
+    <w:abstractNumId w:val="3"/>
+  </w:num>
+  <w:num w:numId="26">
+    <w:abstractNumId w:val="4"/>
+  </w:num>
+  <w:num w:numId="27">
+    <w:abstractNumId w:val="29"/>
+  </w:num>
+  <w:num w:numId="28">
+    <w:abstractNumId w:val="9"/>
+  </w:num>
+  <w:num w:numId="29">
+    <w:abstractNumId w:val="33"/>
+  </w:num>
+  <w:num w:numId="30">
+    <w:abstractNumId w:val="32"/>
+  </w:num>
+  <w:num w:numId="31">
+    <w:abstractNumId w:val="2"/>
+  </w:num>
+  <w:num w:numId="32">
+    <w:abstractNumId w:val="21"/>
+  </w:num>
+  <w:num w:numId="33">
+    <w:abstractNumId w:val="13"/>
+  </w:num>
+  <w:num w:numId="34">
+    <w:abstractNumId w:val="11"/>
+  </w:num>
+  <w:num w:numId="35">
     <w:abstractNumId w:val="28"/>
   </w:num>
-  <w:num w:numId="5" w16cid:durableId="292098880">
-    <w:abstractNumId w:val="23"/>
+  <w:numIdMacAtCleanup w:val="1"/>
+  <w:abstractNum w:abstractNumId="35">
+    <w:lvl w:ilvl="0">
+      <w:start w:val="1"/>
+      <w:numFmt w:val="bullet"/>
+      <w:lvlText w:val="•"/>
+      <w:lvlJc w:val="left"/>
+      <w:suff w:val="space"/>
+    </w:lvl>
+  </w:abstractNum>
+  <w:num w:numId="36">
+    <w:abstractNumId w:val="35"/>
   </w:num>
-  <w:num w:numId="6" w16cid:durableId="260840662">
-    <w:abstractNumId w:val="9"/>
-  </w:num>
-  <w:num w:numId="7" w16cid:durableId="105851743">
-    <w:abstractNumId w:val="25"/>
-  </w:num>
-  <w:num w:numId="8" w16cid:durableId="1850439287">
-    <w:abstractNumId w:val="7"/>
-  </w:num>
-  <w:num w:numId="9" w16cid:durableId="929121542">
-    <w:abstractNumId w:val="4"/>
-  </w:num>
-  <w:num w:numId="10" w16cid:durableId="1648051176">
-    <w:abstractNumId w:val="13"/>
-  </w:num>
-  <w:num w:numId="11" w16cid:durableId="1017924384">
-    <w:abstractNumId w:val="16"/>
-  </w:num>
-  <w:num w:numId="12" w16cid:durableId="1182086674">
-    <w:abstractNumId w:val="15"/>
-  </w:num>
-  <w:num w:numId="13" w16cid:durableId="1065297135">
-    <w:abstractNumId w:val="6"/>
-  </w:num>
-  <w:num w:numId="14" w16cid:durableId="1791243073">
-    <w:abstractNumId w:val="11"/>
-  </w:num>
-  <w:num w:numId="15" w16cid:durableId="921447459">
-    <w:abstractNumId w:val="26"/>
-  </w:num>
-  <w:num w:numId="16" w16cid:durableId="763957584">
-    <w:abstractNumId w:val="0"/>
-  </w:num>
-  <w:num w:numId="17" w16cid:durableId="415826561">
-    <w:abstractNumId w:val="20"/>
-  </w:num>
-  <w:num w:numId="18" w16cid:durableId="128405792">
-    <w:abstractNumId w:val="12"/>
-  </w:num>
-  <w:num w:numId="19" w16cid:durableId="54210531">
-    <w:abstractNumId w:val="19"/>
-  </w:num>
-  <w:num w:numId="20" w16cid:durableId="1449817533">
-    <w:abstractNumId w:val="22"/>
-  </w:num>
-  <w:num w:numId="21" w16cid:durableId="581645109">
-    <w:abstractNumId w:val="10"/>
-  </w:num>
-  <w:num w:numId="22" w16cid:durableId="1458447087">
-    <w:abstractNumId w:val="1"/>
-  </w:num>
-  <w:num w:numId="23" w16cid:durableId="235091226">
-    <w:abstractNumId w:val="18"/>
-  </w:num>
-  <w:num w:numId="24" w16cid:durableId="1073694984">
-    <w:abstractNumId w:val="21"/>
-  </w:num>
-  <w:num w:numId="25" w16cid:durableId="1199662150">
-    <w:abstractNumId w:val="2"/>
-  </w:num>
-  <w:num w:numId="26" w16cid:durableId="1031954224">
-    <w:abstractNumId w:val="3"/>
-  </w:num>
-  <w:num w:numId="27" w16cid:durableId="240529664">
-    <w:abstractNumId w:val="24"/>
-  </w:num>
-  <w:num w:numId="28" w16cid:durableId="1039478971">
-    <w:abstractNumId w:val="8"/>
-  </w:num>
-  <w:num w:numId="29" w16cid:durableId="149250584">
-    <w:abstractNumId w:val="27"/>
-  </w:num>
-  <w:numIdMacAtCleanup w:val="1"/>
 </w:numbering>
 </file>
 
 <file path=word/styles.xml><?xml version="1.0" encoding="utf-8"?>
-<w:styles xmlns:mc="http://schemas.openxmlformats.org/markup-compatibility/2006" xmlns:r="http://schemas.openxmlformats.org/officeDocument/2006/relationships" xmlns:w="http://schemas.openxmlformats.org/wordprocessingml/2006/main" xmlns:w14="http://schemas.microsoft.com/office/word/2010/wordml" xmlns:w15="http://schemas.microsoft.com/office/word/2012/wordml" xmlns:w16cex="http://schemas.microsoft.com/office/word/2018/wordml/cex" xmlns:w16cid="http://schemas.microsoft.com/office/word/2016/wordml/cid" xmlns:w16="http://schemas.microsoft.com/office/word/2018/wordml" xmlns:w16du="http://schemas.microsoft.com/office/word/2023/wordml/word16du" xmlns:w16sdtdh="http://schemas.microsoft.com/office/word/2020/wordml/sdtdatahash" xmlns:w16se="http://schemas.microsoft.com/office/word/2015/wordml/symex" mc:Ignorable="w14 w15 w16se w16cid w16 w16cex w16sdtdh w16du">
+<w:styles xmlns:mc="http://schemas.openxmlformats.org/markup-compatibility/2006" xmlns:r="http://schemas.openxmlformats.org/officeDocument/2006/relationships" xmlns:w="http://schemas.openxmlformats.org/wordprocessingml/2006/main" xmlns:w14="http://schemas.microsoft.com/office/word/2010/wordml" xmlns:w15="http://schemas.microsoft.com/office/word/2012/wordml" xmlns:w16cid="http://schemas.microsoft.com/office/word/2016/wordml/cid" xmlns:w16se="http://schemas.microsoft.com/office/word/2015/wordml/symex" mc:Ignorable="w14 w15 w16se w16cid">
   <w:docDefaults>
     <w:rPrDefault>
       <w:rPr>
@@ -4519,7 +6685,7 @@
     </w:rPrDefault>
     <w:pPrDefault/>
   </w:docDefaults>
-  <w:latentStyles w:defLockedState="0" w:defUIPriority="99" w:defSemiHidden="0" w:defUnhideWhenUsed="0" w:defQFormat="0" w:count="376">
+  <w:latentStyles w:defLockedState="0" w:defUIPriority="99" w:defSemiHidden="0" w:defUnhideWhenUsed="0" w:defQFormat="0" w:count="375">
     <w:lsdException w:name="Normal" w:uiPriority="0" w:qFormat="1"/>
     <w:lsdException w:name="heading 1" w:uiPriority="9" w:qFormat="1"/>
     <w:lsdException w:name="heading 2" w:semiHidden="1" w:uiPriority="9" w:unhideWhenUsed="1" w:qFormat="1"/>
@@ -4895,18 +7061,18 @@
     <w:lsdException w:name="Smart Hyperlink" w:semiHidden="1" w:unhideWhenUsed="1"/>
     <w:lsdException w:name="Hashtag" w:semiHidden="1" w:unhideWhenUsed="1"/>
     <w:lsdException w:name="Unresolved Mention" w:semiHidden="1" w:unhideWhenUsed="1"/>
-    <w:lsdException w:name="Smart Link" w:semiHidden="1" w:unhideWhenUsed="1"/>
   </w:latentStyles>
   <w:style w:type="paragraph" w:default="1" w:styleId="Normal">
     <w:name w:val="Normal"/>
     <w:qFormat/>
-    <w:rsid w:val="00E94CD4"/>
+    <w:rsid w:val="003F7434"/>
     <w:pPr>
       <w:spacing w:before="0" w:after="0" w:line="240" w:lineRule="auto"/>
     </w:pPr>
     <w:rPr>
       <w:rFonts w:ascii="Noto Sans" w:eastAsia="Times New Roman" w:hAnsi="Noto Sans" w:cs="Times New Roman"/>
       <w:sz w:val="22"/>
+      <w:lang w:eastAsia="es-ES_tradnl"/>
     </w:rPr>
   </w:style>
   <w:style w:type="paragraph" w:styleId="Ttulo1">
@@ -4926,6 +7092,7 @@
       <w:b/>
       <w:color w:val="670E35"/>
       <w:sz w:val="22"/>
+      <w:lang w:eastAsia="es-MX"/>
     </w:rPr>
   </w:style>
   <w:style w:type="paragraph" w:styleId="Ttulo2">
@@ -4944,6 +7111,7 @@
       <w:rFonts w:eastAsia="Montserrat Light" w:cs="Montserrat Light"/>
       <w:b/>
       <w:color w:val="666666"/>
+      <w:lang w:eastAsia="es-MX"/>
     </w:rPr>
   </w:style>
   <w:style w:type="paragraph" w:styleId="Ttulo3">
@@ -4961,6 +7129,7 @@
     <w:rPr>
       <w:b/>
       <w:color w:val="FFFFFF"/>
+      <w:lang w:eastAsia="es-MX"/>
     </w:rPr>
   </w:style>
   <w:style w:type="paragraph" w:styleId="Ttulo4">
@@ -4983,6 +7152,7 @@
     </w:pPr>
     <w:rPr>
       <w:b/>
+      <w:lang w:eastAsia="es-MX"/>
     </w:rPr>
   </w:style>
   <w:style w:type="paragraph" w:styleId="Ttulo5">
@@ -5019,6 +7189,7 @@
       <w:b/>
       <w:sz w:val="20"/>
       <w:szCs w:val="20"/>
+      <w:lang w:eastAsia="es-MX"/>
     </w:rPr>
   </w:style>
   <w:style w:type="character" w:default="1" w:styleId="Fuentedeprrafopredeter">
@@ -5048,8 +7219,8 @@
     <w:semiHidden/>
     <w:unhideWhenUsed/>
   </w:style>
-  <w:style w:type="table" w:customStyle="1" w:styleId="TableNormal">
-    <w:name w:val="Table Normal"/>
+  <w:style w:type="table" w:customStyle="1" w:styleId="TableNormal1">
+    <w:name w:val="Table Normal1"/>
     <w:tblPr>
       <w:tblCellMar>
         <w:top w:w="0" w:type="dxa"/>
@@ -5075,10 +7246,11 @@
       <w:b/>
       <w:sz w:val="22"/>
       <w:szCs w:val="72"/>
+      <w:lang w:eastAsia="es-MX"/>
     </w:rPr>
   </w:style>
-  <w:style w:type="table" w:customStyle="1" w:styleId="TableNormal0">
-    <w:name w:val="Table Normal"/>
+  <w:style w:type="table" w:customStyle="1" w:styleId="TableNormal2">
+    <w:name w:val="Table Normal2"/>
     <w:tblPr>
       <w:tblCellMar>
         <w:top w:w="0" w:type="dxa"/>
@@ -5101,6 +7273,9 @@
         <w:tab w:val="right" w:pos="8838"/>
       </w:tabs>
     </w:pPr>
+    <w:rPr>
+      <w:lang w:eastAsia="es-MX"/>
+    </w:rPr>
   </w:style>
   <w:style w:type="character" w:customStyle="1" w:styleId="EncabezadoCar">
     <w:name w:val="Encabezado Car"/>
@@ -5126,6 +7301,9 @@
         <w:tab w:val="right" w:pos="8838"/>
       </w:tabs>
     </w:pPr>
+    <w:rPr>
+      <w:lang w:eastAsia="es-MX"/>
+    </w:rPr>
   </w:style>
   <w:style w:type="character" w:customStyle="1" w:styleId="PiedepginaCar">
     <w:name w:val="Pie de página Car"/>
@@ -5153,6 +7331,7 @@
       <w:color w:val="666666"/>
       <w:sz w:val="48"/>
       <w:szCs w:val="48"/>
+      <w:lang w:eastAsia="es-MX"/>
     </w:rPr>
   </w:style>
   <w:style w:type="paragraph" w:styleId="NormalWeb">
@@ -5164,6 +7343,9 @@
     <w:pPr>
       <w:spacing w:before="100" w:beforeAutospacing="1" w:after="100" w:afterAutospacing="1"/>
     </w:pPr>
+    <w:rPr>
+      <w:lang w:eastAsia="es-MX"/>
+    </w:rPr>
   </w:style>
   <w:style w:type="paragraph" w:styleId="Prrafodelista">
     <w:name w:val="List Paragraph"/>
@@ -5175,6 +7357,9 @@
       <w:ind w:left="720"/>
       <w:contextualSpacing/>
     </w:pPr>
+    <w:rPr>
+      <w:lang w:eastAsia="es-MX"/>
+    </w:rPr>
   </w:style>
   <w:style w:type="paragraph" w:styleId="Textodeglobo">
     <w:name w:val="Balloon Text"/>
@@ -5188,6 +7373,7 @@
       <w:rFonts w:ascii="Segoe UI" w:hAnsi="Segoe UI" w:cs="Segoe UI"/>
       <w:sz w:val="18"/>
       <w:szCs w:val="18"/>
+      <w:lang w:eastAsia="es-MX"/>
     </w:rPr>
   </w:style>
   <w:style w:type="character" w:customStyle="1" w:styleId="TextodegloboCar">
@@ -5237,6 +7423,7 @@
     <w:rPr>
       <w:sz w:val="20"/>
       <w:szCs w:val="20"/>
+      <w:lang w:eastAsia="es-MX"/>
     </w:rPr>
   </w:style>
   <w:style w:type="character" w:customStyle="1" w:styleId="TextonotapieCar">
@@ -5543,6 +7730,9 @@
     <w:pPr>
       <w:spacing w:before="100" w:beforeAutospacing="1" w:after="100" w:afterAutospacing="1"/>
     </w:pPr>
+    <w:rPr>
+      <w:lang w:eastAsia="es-MX"/>
+    </w:rPr>
   </w:style>
   <w:style w:type="paragraph" w:customStyle="1" w:styleId="xl65">
     <w:name w:val="xl65"/>
@@ -5551,6 +7741,9 @@
     <w:pPr>
       <w:spacing w:before="100" w:beforeAutospacing="1" w:after="100" w:afterAutospacing="1"/>
     </w:pPr>
+    <w:rPr>
+      <w:lang w:eastAsia="es-MX"/>
+    </w:rPr>
   </w:style>
   <w:style w:type="paragraph" w:customStyle="1" w:styleId="xl66">
     <w:name w:val="xl66"/>
@@ -5562,6 +7755,7 @@
     <w:rPr>
       <w:rFonts w:ascii="Calibri" w:hAnsi="Calibri" w:cs="Calibri"/>
       <w:color w:val="000000"/>
+      <w:lang w:eastAsia="es-MX"/>
     </w:rPr>
   </w:style>
   <w:style w:type="table" w:styleId="Tablaconcuadrcula4-nfasis6">
@@ -5644,6 +7838,9 @@
     <w:pPr>
       <w:spacing w:before="100" w:beforeAutospacing="1" w:after="100" w:afterAutospacing="1"/>
     </w:pPr>
+    <w:rPr>
+      <w:lang w:eastAsia="es-MX"/>
+    </w:rPr>
   </w:style>
   <w:style w:type="paragraph" w:customStyle="1" w:styleId="xl68">
     <w:name w:val="xl68"/>
@@ -5655,6 +7852,25 @@
     <w:rPr>
       <w:rFonts w:ascii="Calibri" w:hAnsi="Calibri" w:cs="Calibri"/>
       <w:color w:val="000000"/>
+      <w:lang w:eastAsia="es-MX"/>
+    </w:rPr>
+  </w:style>
+  <w:style w:type="paragraph" w:customStyle="1" w:styleId="pdq2pgselectionanchorcontainer">
+    <w:name w:val="pdq2pg_selectionanchorcontainer"/>
+    <w:basedOn w:val="Normal"/>
+    <w:rsid w:val="00360F50"/>
+    <w:pPr>
+      <w:spacing w:before="100" w:beforeAutospacing="1" w:after="100" w:afterAutospacing="1"/>
+    </w:pPr>
+  </w:style>
+  <w:style w:type="paragraph" w:customStyle="1" w:styleId="ListBullet">
+    <w:name w:val="List Bullet"/>
+    <w:pPr>
+      <w:spacing w:before="0" w:after="0" w:line="240" w:lineRule="auto"/>
+    </w:pPr>
+    <w:rPr>
+      <w:rFonts w:ascii="Noto Sans" w:hAnsi="Noto Sans"/>
+      <w:sz w:val="22"/>
     </w:rPr>
   </w:style>
 </w:styles>
@@ -5956,28 +8172,28 @@
 </file>
 
 <file path=customXml/item1.xml><?xml version="1.0" encoding="utf-8"?>
-<b:Sources xmlns:b="http://schemas.openxmlformats.org/officeDocument/2006/bibliography" xmlns="http://schemas.openxmlformats.org/officeDocument/2006/bibliography" SelectedStyle="\APASixthEditionOfficeOnline.xsl" StyleName="APA" Version="6"/>
-</file>
-
-<file path=customXml/item2.xml><?xml version="1.0" encoding="utf-8"?>
 <go:gDocsCustomXmlDataStorage xmlns:go="http://customooxmlschemas.google.com/" xmlns:r="http://schemas.openxmlformats.org/officeDocument/2006/relationships" uri="GoogleDocsCustomDataVersion2">
   <go:docsCustomData xmlns:go="http://customooxmlschemas.google.com/" roundtripDataSignature="AMtx7miQFpWPCfcsQFbrBypFpD4BWtRFLg==">CgMxLjA4AHIhMWpKWC1ZV1ZyUWxfelVTd2oxcUhWdVVqaW9sTHRWRGpD</go:docsCustomData>
 </go:gDocsCustomXmlDataStorage>
 </file>
 
-<file path=customXml/itemProps1.xml><?xml version="1.0" encoding="utf-8"?>
-<ds:datastoreItem xmlns:ds="http://schemas.openxmlformats.org/officeDocument/2006/customXml" ds:itemID="{AD20B228-FA62-4507-8706-4E6F184B2782}">
-  <ds:schemaRefs>
-    <ds:schemaRef ds:uri="http://schemas.openxmlformats.org/officeDocument/2006/bibliography"/>
-  </ds:schemaRefs>
-</ds:datastoreItem>
+<file path=customXml/item2.xml><?xml version="1.0" encoding="utf-8"?>
+<b:Sources xmlns:b="http://schemas.openxmlformats.org/officeDocument/2006/bibliography" xmlns="http://schemas.openxmlformats.org/officeDocument/2006/bibliography" SelectedStyle="\APASixthEditionOfficeOnline.xsl" StyleName="APA" Version="6"/>
 </file>
 
-<file path=customXml/itemProps2.xml><?xml version="1.0" encoding="utf-8"?>
+<file path=customXml/itemProps1.xml><?xml version="1.0" encoding="utf-8"?>
 <ds:datastoreItem xmlns:ds="http://schemas.openxmlformats.org/officeDocument/2006/customXml" ds:itemID="{11111111-1234-1234-1234-123412341234}">
   <ds:schemaRefs>
     <ds:schemaRef ds:uri="http://customooxmlschemas.google.com/"/>
     <ds:schemaRef ds:uri="http://schemas.openxmlformats.org/officeDocument/2006/relationships"/>
   </ds:schemaRefs>
 </ds:datastoreItem>
+</file>
+
+<file path=customXml/itemProps2.xml><?xml version="1.0" encoding="utf-8"?>
+<ds:datastoreItem xmlns:ds="http://schemas.openxmlformats.org/officeDocument/2006/customXml" ds:itemID="{36339060-3F28-D949-9895-241B815C1571}">
+  <ds:schemaRefs>
+    <ds:schemaRef ds:uri="http://schemas.openxmlformats.org/officeDocument/2006/bibliography"/>
+  </ds:schemaRefs>
+</ds:datastoreItem>
 </file>
</xml_diff>